<commit_message>
Update investment proposal and cover letter for FairBanks Maternity & Inpatient Unit
This commit revises the investment proposal and cover letter for the FairBanks Maternity & Inpatient Unit, reflecting updated financial requirements and project scope. The proposal now outlines a total investment range of UGX 190 - 265 million, detailing the phased approach for completing the maternity unit and its associated obstetric theatre. The cover letter has been adjusted to address Mr. Alex Kivumbi, emphasizing the strategic importance of the project and inviting further discussion on investment terms.
</commit_message>
<xml_diff>
--- a/new-grants/FairBanks_Pharmacy_Lab_Radiology_Investment_Proposal_Dr_Martin_Muyingo.docx
+++ b/new-grants/FairBanks_Pharmacy_Lab_Radiology_Investment_Proposal_Dr_Martin_Muyingo.docx
@@ -34,7 +34,7 @@
           <w:b/>
           <w:sz w:val="32"/>
         </w:rPr>
-        <w:t>STRATEGIC INVESTMENT PROPOSAL</w:t>
+        <w:t>INVESTMENT PROPOSAL</w:t>
       </w:r>
     </w:p>
     <w:p>
@@ -46,7 +46,7 @@
           <w:b/>
           <w:sz w:val="38"/>
         </w:rPr>
-        <w:t>PHARMACY + LABORATORY + RADIOLOGY</w:t>
+        <w:t>ULTRASOUND, LABORATORY &amp; PHARMACY</w:t>
       </w:r>
     </w:p>
     <w:p>
@@ -88,26 +88,53 @@
           </w:tcPr>
           <w:p>
             <w:pPr>
+              <w:spacing w:after="60"/>
+            </w:pPr>
+            <w:r>
+              <w:rPr>
+                <w:b/>
+              </w:rPr>
+              <w:t>THE ASK IN ONE PARAGRAPH</w:t>
+            </w:r>
+          </w:p>
+          <w:p>
+            <w:pPr>
               <w:spacing w:after="0"/>
             </w:pPr>
             <w:r>
               <w:rPr>
                 <w:b/>
               </w:rPr>
-              <w:t>INVESTMENT THESIS</w:t>
+              <w:t>UGX 83.4 million</w:t>
+            </w:r>
+            <w:r>
+              <w:t xml:space="preserve"> to add ultrasound imaging, automate our laboratory bench and put real depth into the pharmacy. Of that, </w:t>
             </w:r>
             <w:r>
               <w:rPr>
                 <w:b/>
               </w:rPr>
-              <w:br/>
-              <w:t>Strengthen three high-value diagnostic and treatment-support services that can increase patient retention, improve clinical decision-making and create additional revenue streams for FairBanks.</w:t>
+              <w:t>UGX 29.9 million is already priced</w:t>
+            </w:r>
+            <w:r>
+              <w:t xml:space="preserve"> on a supplier proforma for the equipment itself. Once the three lines are running we expect them to contribute </w:t>
+            </w:r>
+            <w:r>
+              <w:rPr>
+                <w:b/>
+              </w:rPr>
+              <w:t>UGX 6.3-13.3 million a month</w:t>
+            </w:r>
+            <w:r>
+              <w:t xml:space="preserve"> against a facility that currently turns over UGX 8-12 million in total.</w:t>
             </w:r>
           </w:p>
         </w:tc>
       </w:tr>
     </w:tbl>
-    <w:p/>
+    <w:p>
+      <w:r/>
+    </w:p>
     <w:p>
       <w:pPr>
         <w:spacing w:before="160" w:after="60"/>
@@ -117,12 +144,39 @@
           <w:b/>
           <w:sz w:val="26"/>
         </w:rPr>
-        <w:t>1. THE OPPORTUNITY</w:t>
+        <w:t>1. WHY WE ARE BRINGING THIS TO YOU</w:t>
       </w:r>
     </w:p>
     <w:p>
       <w:r>
-        <w:t>FairBanks Medical Centre is an operating community-based medical centre in Kyebando-Kisalosalo, Kampala. The existing model already includes outpatient care, laboratory, pharmacy, specialist support, emergency services and community outreach. The next growth opportunity is to strengthen the Pharmacy and Laboratory and establish and expand Radiology as an integrated diagnostic platform supporting the centre's clinical services.</w:t>
+        <w:t>Dr. Muyingo, you understand the referral problem in Kampala better than most of the people we could have taken this to. A patient walks into a clinic on the Northern Bypass, needs a scan or a liver panel, and walks out holding a piece of paper that sends them somewhere else. Some of them come back to us. A good number do not, and we lose both the revenue and the thread of their care.</w:t>
+      </w:r>
+    </w:p>
+    <w:p>
+      <w:r>
+        <w:t>That is what we are asking you to help us fix. Not in the abstract, but through three specific purchases we have already started pricing, on a defined budget, with monthly reporting you can hold us to.</w:t>
+      </w:r>
+    </w:p>
+    <w:p>
+      <w:pPr>
+        <w:spacing w:before="160" w:after="60"/>
+      </w:pPr>
+      <w:r>
+        <w:rPr>
+          <w:b/>
+          <w:sz w:val="26"/>
+        </w:rPr>
+        <w:t>2. WHERE FAIRBANKS STANDS TODAY</w:t>
+      </w:r>
+    </w:p>
+    <w:p>
+      <w:r>
+        <w:t>FairBanks is an operating community-based medical centre in Kyebando-Kisalosalo, on the Northern Bypass corridor. We run general outpatient and inpatient care, a 24-hour emergency and trauma service, a laboratory, X-ray, a licensed retail pharmacy, and specialist clinics covering internal medicine, paediatrics, obstetrics and gynaecology, ENT, ophthalmology, urology and physiotherapy. We are on the CIC and AAR insurance panels, with Jubilee and Mutual in progress. Alongside the clinical service we run GeriCare elderly care, community screenings and health awareness work.</w:t>
+      </w:r>
+    </w:p>
+    <w:p>
+      <w:r>
+        <w:t>The facility currently turns over UGX 8-12 million a month. That is a working business with a patient base, a licence and a payroll, not a start-up asking you to fund an idea. What it cannot yet do is finish a diagnosis under its own roof.</w:t>
       </w:r>
     </w:p>
     <w:tbl>
@@ -134,7 +188,7 @@
       <w:tblGrid>
         <w:gridCol w:w="3427"/>
         <w:gridCol w:w="3427"/>
-        <w:gridCol w:w="3427"/>
+        <w:gridCol w:w="3428"/>
       </w:tblGrid>
       <w:tr>
         <w:trPr>
@@ -148,14 +202,28 @@
           </w:tcPr>
           <w:p>
             <w:pPr>
+              <w:spacing w:after="40"/>
+              <w:jc w:val="center"/>
+            </w:pPr>
+            <w:r>
+              <w:rPr>
+                <w:b/>
+                <w:sz w:val="17"/>
+              </w:rPr>
+              <w:t>CURRENT MONTHLY REVENUE</w:t>
+            </w:r>
+          </w:p>
+          <w:p>
+            <w:pPr>
               <w:spacing w:after="0"/>
               <w:jc w:val="center"/>
             </w:pPr>
             <w:r>
               <w:rPr>
                 <w:b/>
+                <w:sz w:val="28"/>
               </w:rPr>
-              <w:t>PHARMACY</w:t>
+              <w:t>UGX 8-12M</w:t>
             </w:r>
           </w:p>
         </w:tc>
@@ -167,23 +235,17 @@
           </w:tcPr>
           <w:p>
             <w:pPr>
-              <w:spacing w:after="0"/>
+              <w:spacing w:after="40"/>
               <w:jc w:val="center"/>
             </w:pPr>
             <w:r>
               <w:rPr>
                 <w:b/>
+                <w:sz w:val="17"/>
               </w:rPr>
-              <w:t>LABORATORY</w:t>
+              <w:t>WHAT WE ALREADY RUN</w:t>
             </w:r>
           </w:p>
-        </w:tc>
-        <w:tc>
-          <w:tcPr>
-            <w:tcW w:w="3427" w:type="dxa"/>
-            <w:shd w:val="clear" w:color="auto" w:fill="DDEBE4"/>
-            <w:vAlign w:val="center"/>
-          </w:tcPr>
           <w:p>
             <w:pPr>
               <w:spacing w:after="0"/>
@@ -191,22 +253,31 @@
             </w:pPr>
             <w:r>
               <w:rPr>
-                <w:b/>
+                <w:sz w:val="17"/>
               </w:rPr>
-              <w:t>RADIOLOGY</w:t>
+              <w:t>OPD, inpatient, 24-hour emergency, X-ray, basic laboratory, pharmacy, seven specialist clinics</w:t>
             </w:r>
           </w:p>
         </w:tc>
-      </w:tr>
-      <w:tr>
-        <w:trPr>
-          <w:jc w:val="center"/>
-        </w:trPr>
         <w:tc>
           <w:tcPr>
-            <w:tcW w:w="3427" w:type="dxa"/>
+            <w:tcW w:w="3428" w:type="dxa"/>
+            <w:shd w:val="clear" w:color="auto" w:fill="DDEBE4"/>
             <w:vAlign w:val="center"/>
           </w:tcPr>
+          <w:p>
+            <w:pPr>
+              <w:spacing w:after="40"/>
+              <w:jc w:val="center"/>
+            </w:pPr>
+            <w:r>
+              <w:rPr>
+                <w:b/>
+                <w:sz w:val="17"/>
+              </w:rPr>
+              <w:t>WHAT WE CANNOT DO</w:t>
+            </w:r>
+          </w:p>
           <w:p>
             <w:pPr>
               <w:spacing w:after="0"/>
@@ -214,119 +285,17 @@
             </w:pPr>
             <w:r>
               <w:rPr>
-                <w:b/>
-                <w:sz w:val="18"/>
+                <w:sz w:val="17"/>
               </w:rPr>
-              <w:t>Improve medicine availability</w:t>
-            </w:r>
-            <w:r>
-              <w:rPr>
-                <w:b/>
-                <w:sz w:val="18"/>
-              </w:rPr>
-              <w:br/>
-              <w:t>and capture pharmacy demand</w:t>
-            </w:r>
-          </w:p>
-        </w:tc>
-        <w:tc>
-          <w:tcPr>
-            <w:tcW w:w="3427" w:type="dxa"/>
-            <w:vAlign w:val="center"/>
-          </w:tcPr>
-          <w:p>
-            <w:pPr>
-              <w:spacing w:after="0"/>
-              <w:jc w:val="center"/>
-            </w:pPr>
-            <w:r>
-              <w:rPr>
-                <w:b/>
-                <w:sz w:val="18"/>
-              </w:rPr>
-              <w:t>Expand reliable diagnostic capacity</w:t>
-            </w:r>
-            <w:r>
-              <w:rPr>
-                <w:b/>
-                <w:sz w:val="18"/>
-              </w:rPr>
-              <w:br/>
-              <w:t>and clinical turnaround</w:t>
-            </w:r>
-          </w:p>
-        </w:tc>
-        <w:tc>
-          <w:tcPr>
-            <w:tcW w:w="3427" w:type="dxa"/>
-            <w:vAlign w:val="center"/>
-          </w:tcPr>
-          <w:p>
-            <w:pPr>
-              <w:spacing w:after="0"/>
-              <w:jc w:val="center"/>
-            </w:pPr>
-            <w:r>
-              <w:rPr>
-                <w:b/>
-                <w:sz w:val="18"/>
-              </w:rPr>
-              <w:t>Add imaging capacity to support</w:t>
-            </w:r>
-            <w:r>
-              <w:rPr>
-                <w:b/>
-                <w:sz w:val="18"/>
-              </w:rPr>
-              <w:br/>
-              <w:t>diagnosis, referrals and revenue</w:t>
+              <w:t>Ultrasound, automated chemistry and immunoassay, consistent pharmacy stock</w:t>
             </w:r>
           </w:p>
         </w:tc>
       </w:tr>
     </w:tbl>
-    <w:p/>
-    <w:tbl>
-      <w:tblPr>
-        <w:tblW w:w="0" w:type="auto"/>
-        <w:jc w:val="center"/>
-        <w:tblLook w:val="04A0" w:firstRow="1" w:lastRow="0" w:firstColumn="1" w:lastColumn="0" w:noHBand="0" w:noVBand="1"/>
-      </w:tblPr>
-      <w:tblGrid>
-        <w:gridCol w:w="10282"/>
-      </w:tblGrid>
-      <w:tr>
-        <w:trPr>
-          <w:jc w:val="center"/>
-        </w:trPr>
-        <w:tc>
-          <w:tcPr>
-            <w:tcW w:w="10282" w:type="dxa"/>
-            <w:shd w:val="clear" w:color="auto" w:fill="EAF4EF"/>
-            <w:vAlign w:val="center"/>
-          </w:tcPr>
-          <w:p>
-            <w:pPr>
-              <w:spacing w:after="0"/>
-            </w:pPr>
-            <w:r>
-              <w:rPr>
-                <w:b/>
-              </w:rPr>
-              <w:t>PROPOSED INVESTMENT ENVELOPE: UGX 75–100M</w:t>
-            </w:r>
-            <w:r>
-              <w:rPr>
-                <w:b/>
-              </w:rPr>
-              <w:br/>
-              <w:t>Covering priority Pharmacy, Laboratory and Radiology requirements across equipment, stock, launch and working capital. Working range, subject to supplier quotations.</w:t>
-            </w:r>
-          </w:p>
-        </w:tc>
-      </w:tr>
-    </w:tbl>
-    <w:p/>
+    <w:p>
+      <w:r/>
+    </w:p>
     <w:p>
       <w:pPr>
         <w:spacing w:before="160" w:after="60"/>
@@ -336,7 +305,7 @@
           <w:b/>
           <w:sz w:val="26"/>
         </w:rPr>
-        <w:t>2. WHY THESE THREE SERVICES BELONG IN ONE INVESTMENT</w:t>
+        <w:t>3. THE THREE GAPS</w:t>
       </w:r>
     </w:p>
     <w:p>
@@ -348,10 +317,10 @@
         <w:rPr>
           <w:b/>
         </w:rPr>
-        <w:t xml:space="preserve">Integrated patient journey: </w:t>
+        <w:t xml:space="preserve">Imaging. </w:t>
       </w:r>
       <w:r>
-        <w:t>Patients can access consultation, diagnostic testing, imaging and medicines within one care pathway.</w:t>
+        <w:t>We have X-ray. We do not have ultrasound, which is the scan our patients need most often: antenatal checks, abdominal pain, pelvic and soft-tissue work. Every one of those leaves the building. A Mindray DP-10 and a trolley closes the gap for UGX 11 million.</w:t>
       </w:r>
     </w:p>
     <w:p>
@@ -363,10 +332,843 @@
         <w:rPr>
           <w:b/>
         </w:rPr>
-        <w:t xml:space="preserve">Revenue diversification: </w:t>
+        <w:t xml:space="preserve">Laboratory. </w:t>
       </w:r>
       <w:r>
-        <w:t>The investment creates multiple service lines rather than depending on one source of income.</w:t>
+        <w:t>Our bench copes with routine work. Anything needing chemistry or immunoassay, such as liver and renal function, lipid profiles, thyroid, cardiac markers and hormonal panels, goes out. That costs the patient a day and costs us the test. A dry chemistry analyser and a Fincare immunoassay unit bring the work in-house and cut turnaround from days to the same visit.</w:t>
+      </w:r>
+    </w:p>
+    <w:p>
+      <w:pPr>
+        <w:spacing w:after="200"/>
+        <w:ind w:left="216"/>
+      </w:pPr>
+      <w:r>
+        <w:rPr>
+          <w:b/>
+        </w:rPr>
+        <w:t xml:space="preserve">Pharmacy. </w:t>
+      </w:r>
+      <w:r>
+        <w:t>The pharmacy is licensed and trading, but thin stock means we regularly write a prescription and watch it filled two doors down. This is a working-capital problem rather than an equipment problem, and it is the cheapest of the three to solve.</w:t>
+      </w:r>
+    </w:p>
+    <w:p>
+      <w:pPr>
+        <w:spacing w:before="160" w:after="60"/>
+      </w:pPr>
+      <w:r>
+        <w:rPr>
+          <w:b/>
+          <w:sz w:val="26"/>
+        </w:rPr>
+        <w:t>4. WHAT THE MONEY BUYS</w:t>
+      </w:r>
+    </w:p>
+    <w:tbl>
+      <w:tblPr>
+        <w:tblW w:w="0" w:type="auto"/>
+        <w:jc w:val="center"/>
+        <w:tblLook w:val="04A0" w:firstRow="1" w:lastRow="0" w:firstColumn="1" w:lastColumn="0" w:noHBand="0" w:noVBand="1"/>
+      </w:tblPr>
+      <w:tblGrid>
+        <w:gridCol w:w="2200"/>
+        <w:gridCol w:w="3900"/>
+        <w:gridCol w:w="2482"/>
+        <w:gridCol w:w="1700"/>
+      </w:tblGrid>
+      <w:tr>
+        <w:trPr>
+          <w:cantSplit/>
+          <w:tblHeader/>
+          <w:jc w:val="center"/>
+        </w:trPr>
+        <w:tc>
+          <w:tcPr>
+            <w:tcW w:w="2200" w:type="dxa"/>
+            <w:shd w:val="clear" w:color="auto" w:fill="165A43"/>
+            <w:vAlign w:val="center"/>
+          </w:tcPr>
+          <w:p>
+            <w:pPr>
+              <w:spacing w:after="0"/>
+              <w:jc w:val="center"/>
+            </w:pPr>
+            <w:r>
+              <w:rPr>
+                <w:b/>
+                <w:color w:val="FFFFFF"/>
+                <w:sz w:val="17"/>
+              </w:rPr>
+              <w:t>ITEM</w:t>
+            </w:r>
+          </w:p>
+        </w:tc>
+        <w:tc>
+          <w:tcPr>
+            <w:tcW w:w="3900" w:type="dxa"/>
+            <w:shd w:val="clear" w:color="auto" w:fill="165A43"/>
+            <w:vAlign w:val="center"/>
+          </w:tcPr>
+          <w:p>
+            <w:pPr>
+              <w:spacing w:after="0"/>
+              <w:jc w:val="center"/>
+            </w:pPr>
+            <w:r>
+              <w:rPr>
+                <w:b/>
+                <w:color w:val="FFFFFF"/>
+                <w:sz w:val="17"/>
+              </w:rPr>
+              <w:t>DETAIL</w:t>
+            </w:r>
+          </w:p>
+        </w:tc>
+        <w:tc>
+          <w:tcPr>
+            <w:tcW w:w="2482" w:type="dxa"/>
+            <w:shd w:val="clear" w:color="auto" w:fill="165A43"/>
+            <w:vAlign w:val="center"/>
+          </w:tcPr>
+          <w:p>
+            <w:pPr>
+              <w:spacing w:after="0"/>
+              <w:jc w:val="center"/>
+            </w:pPr>
+            <w:r>
+              <w:rPr>
+                <w:b/>
+                <w:color w:val="FFFFFF"/>
+                <w:sz w:val="17"/>
+              </w:rPr>
+              <w:t>STATUS</w:t>
+            </w:r>
+          </w:p>
+        </w:tc>
+        <w:tc>
+          <w:tcPr>
+            <w:tcW w:w="1700" w:type="dxa"/>
+            <w:shd w:val="clear" w:color="auto" w:fill="165A43"/>
+            <w:vAlign w:val="center"/>
+          </w:tcPr>
+          <w:p>
+            <w:pPr>
+              <w:spacing w:after="0"/>
+              <w:jc w:val="center"/>
+            </w:pPr>
+            <w:r>
+              <w:rPr>
+                <w:b/>
+                <w:color w:val="FFFFFF"/>
+                <w:sz w:val="17"/>
+              </w:rPr>
+              <w:t>UGX</w:t>
+            </w:r>
+          </w:p>
+        </w:tc>
+      </w:tr>
+      <w:tr>
+        <w:trPr>
+          <w:jc w:val="center"/>
+        </w:trPr>
+        <w:tc>
+          <w:tcPr>
+            <w:tcW w:w="2200" w:type="dxa"/>
+            <w:vAlign w:val="center"/>
+          </w:tcPr>
+          <w:p>
+            <w:pPr>
+              <w:spacing w:after="0"/>
+            </w:pPr>
+            <w:r>
+              <w:rPr>
+                <w:sz w:val="17"/>
+              </w:rPr>
+              <w:t>Diagnostic equipment</w:t>
+            </w:r>
+          </w:p>
+        </w:tc>
+        <w:tc>
+          <w:tcPr>
+            <w:tcW w:w="3900" w:type="dxa"/>
+            <w:vAlign w:val="center"/>
+          </w:tcPr>
+          <w:p>
+            <w:pPr>
+              <w:spacing w:after="0"/>
+            </w:pPr>
+            <w:r>
+              <w:rPr>
+                <w:sz w:val="17"/>
+              </w:rPr>
+              <w:t>Mindray DP-10 ultrasound with printer, ultrasound trolley, dry chemistry analyser, Fincare immunoassay analyser, 2000W and 1000W stabilisers</w:t>
+            </w:r>
+          </w:p>
+        </w:tc>
+        <w:tc>
+          <w:tcPr>
+            <w:tcW w:w="2482" w:type="dxa"/>
+            <w:vAlign w:val="center"/>
+          </w:tcPr>
+          <w:p>
+            <w:pPr>
+              <w:spacing w:after="0"/>
+            </w:pPr>
+            <w:r>
+              <w:rPr>
+                <w:sz w:val="17"/>
+              </w:rPr>
+              <w:t>Quoted - Canon Healthcare Systems, proforma 1896</w:t>
+            </w:r>
+          </w:p>
+        </w:tc>
+        <w:tc>
+          <w:tcPr>
+            <w:tcW w:w="1700" w:type="dxa"/>
+            <w:vAlign w:val="center"/>
+          </w:tcPr>
+          <w:p>
+            <w:pPr>
+              <w:spacing w:after="0"/>
+              <w:jc w:val="right"/>
+            </w:pPr>
+            <w:r>
+              <w:rPr>
+                <w:sz w:val="17"/>
+              </w:rPr>
+              <w:t>29,900,000</w:t>
+            </w:r>
+          </w:p>
+        </w:tc>
+      </w:tr>
+      <w:tr>
+        <w:trPr>
+          <w:jc w:val="center"/>
+        </w:trPr>
+        <w:tc>
+          <w:tcPr>
+            <w:tcW w:w="2200" w:type="dxa"/>
+            <w:vAlign w:val="center"/>
+          </w:tcPr>
+          <w:p>
+            <w:pPr>
+              <w:spacing w:after="0"/>
+            </w:pPr>
+            <w:r>
+              <w:rPr>
+                <w:sz w:val="17"/>
+              </w:rPr>
+              <w:t>Pharmacy stock depth</w:t>
+            </w:r>
+          </w:p>
+        </w:tc>
+        <w:tc>
+          <w:tcPr>
+            <w:tcW w:w="3900" w:type="dxa"/>
+            <w:vAlign w:val="center"/>
+          </w:tcPr>
+          <w:p>
+            <w:pPr>
+              <w:spacing w:after="0"/>
+            </w:pPr>
+            <w:r>
+              <w:rPr>
+                <w:sz w:val="17"/>
+              </w:rPr>
+              <w:t>Opening working capital to carry a fuller formulary and stop losing filled prescriptions to neighbouring outlets</w:t>
+            </w:r>
+          </w:p>
+        </w:tc>
+        <w:tc>
+          <w:tcPr>
+            <w:tcW w:w="2482" w:type="dxa"/>
+            <w:vAlign w:val="center"/>
+          </w:tcPr>
+          <w:p>
+            <w:pPr>
+              <w:spacing w:after="0"/>
+            </w:pPr>
+            <w:r>
+              <w:rPr>
+                <w:sz w:val="17"/>
+              </w:rPr>
+              <w:t>Estimated from our own dispensing records</w:t>
+            </w:r>
+          </w:p>
+        </w:tc>
+        <w:tc>
+          <w:tcPr>
+            <w:tcW w:w="1700" w:type="dxa"/>
+            <w:vAlign w:val="center"/>
+          </w:tcPr>
+          <w:p>
+            <w:pPr>
+              <w:spacing w:after="0"/>
+              <w:jc w:val="right"/>
+            </w:pPr>
+            <w:r>
+              <w:rPr>
+                <w:sz w:val="17"/>
+              </w:rPr>
+              <w:t>18,000,000</w:t>
+            </w:r>
+          </w:p>
+        </w:tc>
+      </w:tr>
+      <w:tr>
+        <w:trPr>
+          <w:jc w:val="center"/>
+        </w:trPr>
+        <w:tc>
+          <w:tcPr>
+            <w:tcW w:w="2200" w:type="dxa"/>
+            <w:vAlign w:val="center"/>
+          </w:tcPr>
+          <w:p>
+            <w:pPr>
+              <w:spacing w:after="0"/>
+            </w:pPr>
+            <w:r>
+              <w:rPr>
+                <w:sz w:val="17"/>
+              </w:rPr>
+              <w:t>Laboratory reagents and consumables</w:t>
+            </w:r>
+          </w:p>
+        </w:tc>
+        <w:tc>
+          <w:tcPr>
+            <w:tcW w:w="3900" w:type="dxa"/>
+            <w:vAlign w:val="center"/>
+          </w:tcPr>
+          <w:p>
+            <w:pPr>
+              <w:spacing w:after="0"/>
+            </w:pPr>
+            <w:r>
+              <w:rPr>
+                <w:sz w:val="17"/>
+              </w:rPr>
+              <w:t>Opening three-month fill for the chemistry and immunoassay analysers, plus controls and quality-control material</w:t>
+            </w:r>
+          </w:p>
+        </w:tc>
+        <w:tc>
+          <w:tcPr>
+            <w:tcW w:w="2482" w:type="dxa"/>
+            <w:vAlign w:val="center"/>
+          </w:tcPr>
+          <w:p>
+            <w:pPr>
+              <w:spacing w:after="0"/>
+            </w:pPr>
+            <w:r>
+              <w:rPr>
+                <w:sz w:val="17"/>
+              </w:rPr>
+              <w:t>To be quoted with the analysers</w:t>
+            </w:r>
+          </w:p>
+        </w:tc>
+        <w:tc>
+          <w:tcPr>
+            <w:tcW w:w="1700" w:type="dxa"/>
+            <w:vAlign w:val="center"/>
+          </w:tcPr>
+          <w:p>
+            <w:pPr>
+              <w:spacing w:after="0"/>
+              <w:jc w:val="right"/>
+            </w:pPr>
+            <w:r>
+              <w:rPr>
+                <w:sz w:val="17"/>
+              </w:rPr>
+              <w:t>9,200,000</w:t>
+            </w:r>
+          </w:p>
+        </w:tc>
+      </w:tr>
+      <w:tr>
+        <w:trPr>
+          <w:jc w:val="center"/>
+        </w:trPr>
+        <w:tc>
+          <w:tcPr>
+            <w:tcW w:w="2200" w:type="dxa"/>
+            <w:vAlign w:val="center"/>
+          </w:tcPr>
+          <w:p>
+            <w:pPr>
+              <w:spacing w:after="0"/>
+            </w:pPr>
+            <w:r>
+              <w:rPr>
+                <w:sz w:val="17"/>
+              </w:rPr>
+              <w:t>Staffing</w:t>
+            </w:r>
+          </w:p>
+        </w:tc>
+        <w:tc>
+          <w:tcPr>
+            <w:tcW w:w="3900" w:type="dxa"/>
+            <w:vAlign w:val="center"/>
+          </w:tcPr>
+          <w:p>
+            <w:pPr>
+              <w:spacing w:after="0"/>
+            </w:pPr>
+            <w:r>
+              <w:rPr>
+                <w:sz w:val="17"/>
+              </w:rPr>
+              <w:t>Sonographer and laboratory technologist: recruitment and first two months of salary</w:t>
+            </w:r>
+          </w:p>
+        </w:tc>
+        <w:tc>
+          <w:tcPr>
+            <w:tcW w:w="2482" w:type="dxa"/>
+            <w:vAlign w:val="center"/>
+          </w:tcPr>
+          <w:p>
+            <w:pPr>
+              <w:spacing w:after="0"/>
+            </w:pPr>
+            <w:r>
+              <w:rPr>
+                <w:sz w:val="17"/>
+              </w:rPr>
+              <w:t>Estimated at current Kampala rates</w:t>
+            </w:r>
+          </w:p>
+        </w:tc>
+        <w:tc>
+          <w:tcPr>
+            <w:tcW w:w="1700" w:type="dxa"/>
+            <w:vAlign w:val="center"/>
+          </w:tcPr>
+          <w:p>
+            <w:pPr>
+              <w:spacing w:after="0"/>
+              <w:jc w:val="right"/>
+            </w:pPr>
+            <w:r>
+              <w:rPr>
+                <w:sz w:val="17"/>
+              </w:rPr>
+              <w:t>7,400,000</w:t>
+            </w:r>
+          </w:p>
+        </w:tc>
+      </w:tr>
+      <w:tr>
+        <w:trPr>
+          <w:jc w:val="center"/>
+        </w:trPr>
+        <w:tc>
+          <w:tcPr>
+            <w:tcW w:w="2200" w:type="dxa"/>
+            <w:vAlign w:val="center"/>
+          </w:tcPr>
+          <w:p>
+            <w:pPr>
+              <w:spacing w:after="0"/>
+            </w:pPr>
+            <w:r>
+              <w:rPr>
+                <w:sz w:val="17"/>
+              </w:rPr>
+              <w:t>Ultrasound room</w:t>
+            </w:r>
+          </w:p>
+        </w:tc>
+        <w:tc>
+          <w:tcPr>
+            <w:tcW w:w="3900" w:type="dxa"/>
+            <w:vAlign w:val="center"/>
+          </w:tcPr>
+          <w:p>
+            <w:pPr>
+              <w:spacing w:after="0"/>
+            </w:pPr>
+            <w:r>
+              <w:rPr>
+                <w:sz w:val="17"/>
+              </w:rPr>
+              <w:t>Couch, screening, cabinetry, lighting, dedicated power point, minor works, installation and commissioning</w:t>
+            </w:r>
+          </w:p>
+        </w:tc>
+        <w:tc>
+          <w:tcPr>
+            <w:tcW w:w="2482" w:type="dxa"/>
+            <w:vAlign w:val="center"/>
+          </w:tcPr>
+          <w:p>
+            <w:pPr>
+              <w:spacing w:after="0"/>
+            </w:pPr>
+            <w:r>
+              <w:rPr>
+                <w:sz w:val="17"/>
+              </w:rPr>
+              <w:t>Estimated - local contractor</w:t>
+            </w:r>
+          </w:p>
+        </w:tc>
+        <w:tc>
+          <w:tcPr>
+            <w:tcW w:w="1700" w:type="dxa"/>
+            <w:vAlign w:val="center"/>
+          </w:tcPr>
+          <w:p>
+            <w:pPr>
+              <w:spacing w:after="0"/>
+              <w:jc w:val="right"/>
+            </w:pPr>
+            <w:r>
+              <w:rPr>
+                <w:sz w:val="17"/>
+              </w:rPr>
+              <w:t>6,500,000</w:t>
+            </w:r>
+          </w:p>
+        </w:tc>
+      </w:tr>
+      <w:tr>
+        <w:trPr>
+          <w:jc w:val="center"/>
+        </w:trPr>
+        <w:tc>
+          <w:tcPr>
+            <w:tcW w:w="2200" w:type="dxa"/>
+            <w:vAlign w:val="center"/>
+          </w:tcPr>
+          <w:p>
+            <w:pPr>
+              <w:spacing w:after="0"/>
+            </w:pPr>
+            <w:r>
+              <w:rPr>
+                <w:sz w:val="17"/>
+              </w:rPr>
+              <w:t>Power protection and cold chain</w:t>
+            </w:r>
+          </w:p>
+        </w:tc>
+        <w:tc>
+          <w:tcPr>
+            <w:tcW w:w="3900" w:type="dxa"/>
+            <w:vAlign w:val="center"/>
+          </w:tcPr>
+          <w:p>
+            <w:pPr>
+              <w:spacing w:after="0"/>
+            </w:pPr>
+            <w:r>
+              <w:rPr>
+                <w:sz w:val="17"/>
+              </w:rPr>
+              <w:t>UPS and inverter cover for the analysers, and a dedicated reagent refrigerator</w:t>
+            </w:r>
+          </w:p>
+        </w:tc>
+        <w:tc>
+          <w:tcPr>
+            <w:tcW w:w="2482" w:type="dxa"/>
+            <w:vAlign w:val="center"/>
+          </w:tcPr>
+          <w:p>
+            <w:pPr>
+              <w:spacing w:after="0"/>
+            </w:pPr>
+            <w:r>
+              <w:rPr>
+                <w:sz w:val="17"/>
+              </w:rPr>
+              <w:t>To be quoted</w:t>
+            </w:r>
+          </w:p>
+        </w:tc>
+        <w:tc>
+          <w:tcPr>
+            <w:tcW w:w="1700" w:type="dxa"/>
+            <w:vAlign w:val="center"/>
+          </w:tcPr>
+          <w:p>
+            <w:pPr>
+              <w:spacing w:after="0"/>
+              <w:jc w:val="right"/>
+            </w:pPr>
+            <w:r>
+              <w:rPr>
+                <w:sz w:val="17"/>
+              </w:rPr>
+              <w:t>3,800,000</w:t>
+            </w:r>
+          </w:p>
+        </w:tc>
+      </w:tr>
+      <w:tr>
+        <w:trPr>
+          <w:jc w:val="center"/>
+        </w:trPr>
+        <w:tc>
+          <w:tcPr>
+            <w:tcW w:w="2200" w:type="dxa"/>
+            <w:vAlign w:val="center"/>
+          </w:tcPr>
+          <w:p>
+            <w:pPr>
+              <w:spacing w:after="0"/>
+            </w:pPr>
+            <w:r>
+              <w:rPr>
+                <w:sz w:val="17"/>
+              </w:rPr>
+              <w:t>Licensing, training and launch</w:t>
+            </w:r>
+          </w:p>
+        </w:tc>
+        <w:tc>
+          <w:tcPr>
+            <w:tcW w:w="3900" w:type="dxa"/>
+            <w:vAlign w:val="center"/>
+          </w:tcPr>
+          <w:p>
+            <w:pPr>
+              <w:spacing w:after="0"/>
+            </w:pPr>
+            <w:r>
+              <w:rPr>
+                <w:sz w:val="17"/>
+              </w:rPr>
+              <w:t>Practitioner registration, NDA and premises compliance, operator training, opening publicity</w:t>
+            </w:r>
+          </w:p>
+        </w:tc>
+        <w:tc>
+          <w:tcPr>
+            <w:tcW w:w="2482" w:type="dxa"/>
+            <w:vAlign w:val="center"/>
+          </w:tcPr>
+          <w:p>
+            <w:pPr>
+              <w:spacing w:after="0"/>
+            </w:pPr>
+            <w:r>
+              <w:rPr>
+                <w:sz w:val="17"/>
+              </w:rPr>
+              <w:t>Estimated</w:t>
+            </w:r>
+          </w:p>
+        </w:tc>
+        <w:tc>
+          <w:tcPr>
+            <w:tcW w:w="1700" w:type="dxa"/>
+            <w:vAlign w:val="center"/>
+          </w:tcPr>
+          <w:p>
+            <w:pPr>
+              <w:spacing w:after="0"/>
+              <w:jc w:val="right"/>
+            </w:pPr>
+            <w:r>
+              <w:rPr>
+                <w:sz w:val="17"/>
+              </w:rPr>
+              <w:t>2,600,000</w:t>
+            </w:r>
+          </w:p>
+        </w:tc>
+      </w:tr>
+      <w:tr>
+        <w:trPr>
+          <w:jc w:val="center"/>
+        </w:trPr>
+        <w:tc>
+          <w:tcPr>
+            <w:tcW w:w="2200" w:type="dxa"/>
+            <w:vAlign w:val="center"/>
+          </w:tcPr>
+          <w:p>
+            <w:pPr>
+              <w:spacing w:after="0"/>
+            </w:pPr>
+            <w:r>
+              <w:rPr>
+                <w:sz w:val="17"/>
+              </w:rPr>
+              <w:t>Contingency (approx. 8%)</w:t>
+            </w:r>
+          </w:p>
+        </w:tc>
+        <w:tc>
+          <w:tcPr>
+            <w:tcW w:w="3900" w:type="dxa"/>
+            <w:vAlign w:val="center"/>
+          </w:tcPr>
+          <w:p>
+            <w:pPr>
+              <w:spacing w:after="0"/>
+            </w:pPr>
+            <w:r>
+              <w:rPr>
+                <w:sz w:val="17"/>
+              </w:rPr>
+              <w:t>Exchange movement, freight and scope corrections</w:t>
+            </w:r>
+          </w:p>
+        </w:tc>
+        <w:tc>
+          <w:tcPr>
+            <w:tcW w:w="2482" w:type="dxa"/>
+            <w:vAlign w:val="center"/>
+          </w:tcPr>
+          <w:p>
+            <w:pPr>
+              <w:spacing w:after="0"/>
+            </w:pPr>
+            <w:r>
+              <w:rPr>
+                <w:sz w:val="17"/>
+              </w:rPr>
+              <w:t>-</w:t>
+            </w:r>
+          </w:p>
+        </w:tc>
+        <w:tc>
+          <w:tcPr>
+            <w:tcW w:w="1700" w:type="dxa"/>
+            <w:vAlign w:val="center"/>
+          </w:tcPr>
+          <w:p>
+            <w:pPr>
+              <w:spacing w:after="0"/>
+              <w:jc w:val="right"/>
+            </w:pPr>
+            <w:r>
+              <w:rPr>
+                <w:sz w:val="17"/>
+              </w:rPr>
+              <w:t>6,000,000</w:t>
+            </w:r>
+          </w:p>
+        </w:tc>
+      </w:tr>
+      <w:tr>
+        <w:trPr>
+          <w:jc w:val="center"/>
+        </w:trPr>
+        <w:tc>
+          <w:tcPr>
+            <w:tcW w:w="2200" w:type="dxa"/>
+            <w:shd w:val="clear" w:color="auto" w:fill="DDEBE4"/>
+            <w:vAlign w:val="center"/>
+          </w:tcPr>
+          <w:p>
+            <w:pPr>
+              <w:spacing w:after="0"/>
+            </w:pPr>
+            <w:r>
+              <w:rPr>
+                <w:b/>
+                <w:sz w:val="17"/>
+              </w:rPr>
+              <w:t>TOTAL</w:t>
+            </w:r>
+          </w:p>
+        </w:tc>
+        <w:tc>
+          <w:tcPr>
+            <w:tcW w:w="3900" w:type="dxa"/>
+            <w:shd w:val="clear" w:color="auto" w:fill="DDEBE4"/>
+            <w:vAlign w:val="center"/>
+          </w:tcPr>
+          <w:p>
+            <w:pPr>
+              <w:spacing w:after="0"/>
+            </w:pPr>
+            <w:r>
+              <w:rPr>
+                <w:b/>
+                <w:sz w:val="17"/>
+              </w:rPr>
+              <w:t/>
+            </w:r>
+          </w:p>
+        </w:tc>
+        <w:tc>
+          <w:tcPr>
+            <w:tcW w:w="2482" w:type="dxa"/>
+            <w:shd w:val="clear" w:color="auto" w:fill="DDEBE4"/>
+            <w:vAlign w:val="center"/>
+          </w:tcPr>
+          <w:p>
+            <w:pPr>
+              <w:spacing w:after="0"/>
+            </w:pPr>
+            <w:r>
+              <w:rPr>
+                <w:b/>
+                <w:sz w:val="17"/>
+              </w:rPr>
+              <w:t/>
+            </w:r>
+          </w:p>
+        </w:tc>
+        <w:tc>
+          <w:tcPr>
+            <w:tcW w:w="1700" w:type="dxa"/>
+            <w:shd w:val="clear" w:color="auto" w:fill="DDEBE4"/>
+            <w:vAlign w:val="center"/>
+          </w:tcPr>
+          <w:p>
+            <w:pPr>
+              <w:spacing w:after="0"/>
+              <w:jc w:val="right"/>
+            </w:pPr>
+            <w:r>
+              <w:rPr>
+                <w:b/>
+                <w:sz w:val="17"/>
+              </w:rPr>
+              <w:t>83,400,000</w:t>
+            </w:r>
+          </w:p>
+        </w:tc>
+      </w:tr>
+    </w:tbl>
+    <w:p>
+      <w:r>
+        <w:rPr>
+          <w:b/>
+        </w:rPr>
+        <w:t xml:space="preserve">About the quotation. </w:t>
+      </w:r>
+      <w:r>
+        <w:t>The equipment line is not a guess. Canon Healthcare Systems Ltd of Kireka-Namugongo Road issued us proforma invoice 1896 on 13 April 2026 covering all six items at UGX 29,900,000, with the equipment held in stock and payment due on delivery against a local purchase order. That quotation carried 60 days of validity and has therefore lapsed, so we would re-confirm pricing before placing any order, which is part of what the contingency line is for. It is reproduced in full in the appendix. Every other figure in the table is our own estimate and should be read as one until it has been quoted.</w:t>
+      </w:r>
+    </w:p>
+    <w:p>
+      <w:pPr>
+        <w:spacing w:before="160" w:after="60"/>
+      </w:pPr>
+      <w:r>
+        <w:rPr>
+          <w:b/>
+          <w:sz w:val="26"/>
+        </w:rPr>
+        <w:t>5. WHAT IT EARNS</w:t>
+      </w:r>
+    </w:p>
+    <w:p>
+      <w:r>
+        <w:t>We have set out the assumptions rather than a single headline number, because the assumptions are the part worth arguing about.</w:t>
       </w:r>
     </w:p>
     <w:p>
@@ -378,10 +1180,10 @@
         <w:rPr>
           <w:b/>
         </w:rPr>
-        <w:t xml:space="preserve">Patient retention: </w:t>
+        <w:t xml:space="preserve">Ultrasound. </w:t>
       </w:r>
       <w:r>
-        <w:t>A stronger in-house diagnostic and pharmacy offering reduces avoidable external referrals and improves continuity of care.</w:t>
+        <w:t>120 to 180 scans a month at UGX 30,000-40,000. That is six or seven scans a working day, which is modest for a centre already running antenatal and general outpatient clinics.</w:t>
       </w:r>
     </w:p>
     <w:p>
@@ -393,10 +1195,452 @@
         <w:rPr>
           <w:b/>
         </w:rPr>
-        <w:t xml:space="preserve">Scalable platform: </w:t>
+        <w:t xml:space="preserve">Laboratory. </w:t>
       </w:r>
       <w:r>
-        <w:t>The three components can be launched in phases, measured independently and expanded as utilisation grows.</w:t>
+        <w:t>350 to 500 additional in-house tests a month at an average of UGX 18,000-25,000. This is work we already generate and currently refer out for nothing.</w:t>
+      </w:r>
+    </w:p>
+    <w:p>
+      <w:pPr>
+        <w:spacing w:after="200"/>
+        <w:ind w:left="216"/>
+      </w:pPr>
+      <w:r>
+        <w:rPr>
+          <w:b/>
+        </w:rPr>
+        <w:t xml:space="preserve">Pharmacy. </w:t>
+      </w:r>
+      <w:r>
+        <w:t>UGX 4-6 million of additional monthly sales at roughly 30% gross margin. Pharmacy is a margin business, so its contribution looks small beside its revenue. That is normal, and we would rather show it plainly than dress it up.</w:t>
+      </w:r>
+    </w:p>
+    <w:tbl>
+      <w:tblPr>
+        <w:tblW w:w="0" w:type="auto"/>
+        <w:jc w:val="center"/>
+        <w:tblLook w:val="04A0" w:firstRow="1" w:lastRow="0" w:firstColumn="1" w:lastColumn="0" w:noHBand="0" w:noVBand="1"/>
+      </w:tblPr>
+      <w:tblGrid>
+        <w:gridCol w:w="2400"/>
+        <w:gridCol w:w="2500"/>
+        <w:gridCol w:w="2900"/>
+        <w:gridCol w:w="2482"/>
+      </w:tblGrid>
+      <w:tr>
+        <w:trPr>
+          <w:cantSplit/>
+          <w:tblHeader/>
+          <w:jc w:val="center"/>
+        </w:trPr>
+        <w:tc>
+          <w:tcPr>
+            <w:tcW w:w="2400" w:type="dxa"/>
+            <w:shd w:val="clear" w:color="auto" w:fill="165A43"/>
+            <w:vAlign w:val="center"/>
+          </w:tcPr>
+          <w:p>
+            <w:pPr>
+              <w:spacing w:after="0"/>
+              <w:jc w:val="center"/>
+            </w:pPr>
+            <w:r>
+              <w:rPr>
+                <w:b/>
+                <w:color w:val="FFFFFF"/>
+                <w:sz w:val="17"/>
+              </w:rPr>
+              <w:t>SERVICE LINE</w:t>
+            </w:r>
+          </w:p>
+        </w:tc>
+        <w:tc>
+          <w:tcPr>
+            <w:tcW w:w="2500" w:type="dxa"/>
+            <w:shd w:val="clear" w:color="auto" w:fill="165A43"/>
+            <w:vAlign w:val="center"/>
+          </w:tcPr>
+          <w:p>
+            <w:pPr>
+              <w:spacing w:after="0"/>
+              <w:jc w:val="center"/>
+            </w:pPr>
+            <w:r>
+              <w:rPr>
+                <w:b/>
+                <w:color w:val="FFFFFF"/>
+                <w:sz w:val="17"/>
+              </w:rPr>
+              <w:t>MONTHLY REVENUE</w:t>
+            </w:r>
+          </w:p>
+        </w:tc>
+        <w:tc>
+          <w:tcPr>
+            <w:tcW w:w="2900" w:type="dxa"/>
+            <w:shd w:val="clear" w:color="auto" w:fill="165A43"/>
+            <w:vAlign w:val="center"/>
+          </w:tcPr>
+          <w:p>
+            <w:pPr>
+              <w:spacing w:after="0"/>
+              <w:jc w:val="center"/>
+            </w:pPr>
+            <w:r>
+              <w:rPr>
+                <w:b/>
+                <w:color w:val="FFFFFF"/>
+                <w:sz w:val="17"/>
+              </w:rPr>
+              <w:t>DIRECT COSTS</w:t>
+            </w:r>
+          </w:p>
+        </w:tc>
+        <w:tc>
+          <w:tcPr>
+            <w:tcW w:w="2482" w:type="dxa"/>
+            <w:shd w:val="clear" w:color="auto" w:fill="165A43"/>
+            <w:vAlign w:val="center"/>
+          </w:tcPr>
+          <w:p>
+            <w:pPr>
+              <w:spacing w:after="0"/>
+              <w:jc w:val="center"/>
+            </w:pPr>
+            <w:r>
+              <w:rPr>
+                <w:b/>
+                <w:color w:val="FFFFFF"/>
+                <w:sz w:val="17"/>
+              </w:rPr>
+              <w:t>MONTHLY CONTRIBUTION</w:t>
+            </w:r>
+          </w:p>
+        </w:tc>
+      </w:tr>
+      <w:tr>
+        <w:trPr>
+          <w:jc w:val="center"/>
+        </w:trPr>
+        <w:tc>
+          <w:tcPr>
+            <w:tcW w:w="2400" w:type="dxa"/>
+            <w:vAlign w:val="center"/>
+          </w:tcPr>
+          <w:p>
+            <w:pPr>
+              <w:spacing w:after="0"/>
+            </w:pPr>
+            <w:r>
+              <w:rPr>
+                <w:sz w:val="17"/>
+              </w:rPr>
+              <w:t>Ultrasound</w:t>
+            </w:r>
+          </w:p>
+        </w:tc>
+        <w:tc>
+          <w:tcPr>
+            <w:tcW w:w="2500" w:type="dxa"/>
+            <w:vAlign w:val="center"/>
+          </w:tcPr>
+          <w:p>
+            <w:pPr>
+              <w:spacing w:after="0"/>
+            </w:pPr>
+            <w:r>
+              <w:rPr>
+                <w:sz w:val="17"/>
+              </w:rPr>
+              <w:t>UGX 3.6 - 7.2M</w:t>
+            </w:r>
+          </w:p>
+        </w:tc>
+        <w:tc>
+          <w:tcPr>
+            <w:tcW w:w="2900" w:type="dxa"/>
+            <w:vAlign w:val="center"/>
+          </w:tcPr>
+          <w:p>
+            <w:pPr>
+              <w:spacing w:after="0"/>
+            </w:pPr>
+            <w:r>
+              <w:rPr>
+                <w:sz w:val="17"/>
+              </w:rPr>
+              <w:t>UGX 1.2 - 1.6M: sonographer, consumables, power, service</w:t>
+            </w:r>
+          </w:p>
+        </w:tc>
+        <w:tc>
+          <w:tcPr>
+            <w:tcW w:w="2482" w:type="dxa"/>
+            <w:vAlign w:val="center"/>
+          </w:tcPr>
+          <w:p>
+            <w:pPr>
+              <w:spacing w:after="0"/>
+            </w:pPr>
+            <w:r>
+              <w:rPr>
+                <w:sz w:val="17"/>
+              </w:rPr>
+              <w:t>UGX 2.4 - 5.6M</w:t>
+            </w:r>
+          </w:p>
+        </w:tc>
+      </w:tr>
+      <w:tr>
+        <w:trPr>
+          <w:jc w:val="center"/>
+        </w:trPr>
+        <w:tc>
+          <w:tcPr>
+            <w:tcW w:w="2400" w:type="dxa"/>
+            <w:vAlign w:val="center"/>
+          </w:tcPr>
+          <w:p>
+            <w:pPr>
+              <w:spacing w:after="0"/>
+            </w:pPr>
+            <w:r>
+              <w:rPr>
+                <w:sz w:val="17"/>
+              </w:rPr>
+              <w:t>Laboratory (incremental)</w:t>
+            </w:r>
+          </w:p>
+        </w:tc>
+        <w:tc>
+          <w:tcPr>
+            <w:tcW w:w="2500" w:type="dxa"/>
+            <w:vAlign w:val="center"/>
+          </w:tcPr>
+          <w:p>
+            <w:pPr>
+              <w:spacing w:after="0"/>
+            </w:pPr>
+            <w:r>
+              <w:rPr>
+                <w:sz w:val="17"/>
+              </w:rPr>
+              <w:t>UGX 6.3 - 12.5M</w:t>
+            </w:r>
+          </w:p>
+        </w:tc>
+        <w:tc>
+          <w:tcPr>
+            <w:tcW w:w="2900" w:type="dxa"/>
+            <w:vAlign w:val="center"/>
+          </w:tcPr>
+          <w:p>
+            <w:pPr>
+              <w:spacing w:after="0"/>
+            </w:pPr>
+            <w:r>
+              <w:rPr>
+                <w:sz w:val="17"/>
+              </w:rPr>
+              <w:t>UGX 3.6 - 6.6M: reagents at 40-45%, technologist, QC, service</w:t>
+            </w:r>
+          </w:p>
+        </w:tc>
+        <w:tc>
+          <w:tcPr>
+            <w:tcW w:w="2482" w:type="dxa"/>
+            <w:vAlign w:val="center"/>
+          </w:tcPr>
+          <w:p>
+            <w:pPr>
+              <w:spacing w:after="0"/>
+            </w:pPr>
+            <w:r>
+              <w:rPr>
+                <w:sz w:val="17"/>
+              </w:rPr>
+              <w:t>UGX 2.7 - 5.9M</w:t>
+            </w:r>
+          </w:p>
+        </w:tc>
+      </w:tr>
+      <w:tr>
+        <w:trPr>
+          <w:jc w:val="center"/>
+        </w:trPr>
+        <w:tc>
+          <w:tcPr>
+            <w:tcW w:w="2400" w:type="dxa"/>
+            <w:vAlign w:val="center"/>
+          </w:tcPr>
+          <w:p>
+            <w:pPr>
+              <w:spacing w:after="0"/>
+            </w:pPr>
+            <w:r>
+              <w:rPr>
+                <w:sz w:val="17"/>
+              </w:rPr>
+              <w:t>Pharmacy (incremental)</w:t>
+            </w:r>
+          </w:p>
+        </w:tc>
+        <w:tc>
+          <w:tcPr>
+            <w:tcW w:w="2500" w:type="dxa"/>
+            <w:vAlign w:val="center"/>
+          </w:tcPr>
+          <w:p>
+            <w:pPr>
+              <w:spacing w:after="0"/>
+            </w:pPr>
+            <w:r>
+              <w:rPr>
+                <w:sz w:val="17"/>
+              </w:rPr>
+              <w:t>UGX 4.0 - 6.0M</w:t>
+            </w:r>
+          </w:p>
+        </w:tc>
+        <w:tc>
+          <w:tcPr>
+            <w:tcW w:w="2900" w:type="dxa"/>
+            <w:vAlign w:val="center"/>
+          </w:tcPr>
+          <w:p>
+            <w:pPr>
+              <w:spacing w:after="0"/>
+            </w:pPr>
+            <w:r>
+              <w:rPr>
+                <w:sz w:val="17"/>
+              </w:rPr>
+              <w:t>UGX 2.8 - 4.2M: cost of goods at roughly 70%</w:t>
+            </w:r>
+          </w:p>
+        </w:tc>
+        <w:tc>
+          <w:tcPr>
+            <w:tcW w:w="2482" w:type="dxa"/>
+            <w:vAlign w:val="center"/>
+          </w:tcPr>
+          <w:p>
+            <w:pPr>
+              <w:spacing w:after="0"/>
+            </w:pPr>
+            <w:r>
+              <w:rPr>
+                <w:sz w:val="17"/>
+              </w:rPr>
+              <w:t>UGX 1.2 - 1.8M</w:t>
+            </w:r>
+          </w:p>
+        </w:tc>
+      </w:tr>
+      <w:tr>
+        <w:trPr>
+          <w:jc w:val="center"/>
+        </w:trPr>
+        <w:tc>
+          <w:tcPr>
+            <w:tcW w:w="2400" w:type="dxa"/>
+            <w:shd w:val="clear" w:color="auto" w:fill="DDEBE4"/>
+            <w:vAlign w:val="center"/>
+          </w:tcPr>
+          <w:p>
+            <w:pPr>
+              <w:spacing w:after="0"/>
+            </w:pPr>
+            <w:r>
+              <w:rPr>
+                <w:b/>
+                <w:sz w:val="17"/>
+              </w:rPr>
+              <w:t>COMBINED</w:t>
+            </w:r>
+          </w:p>
+        </w:tc>
+        <w:tc>
+          <w:tcPr>
+            <w:tcW w:w="2500" w:type="dxa"/>
+            <w:shd w:val="clear" w:color="auto" w:fill="DDEBE4"/>
+            <w:vAlign w:val="center"/>
+          </w:tcPr>
+          <w:p>
+            <w:pPr>
+              <w:spacing w:after="0"/>
+            </w:pPr>
+            <w:r>
+              <w:rPr>
+                <w:b/>
+                <w:sz w:val="17"/>
+              </w:rPr>
+              <w:t>UGX 13.9 - 25.7M</w:t>
+            </w:r>
+          </w:p>
+        </w:tc>
+        <w:tc>
+          <w:tcPr>
+            <w:tcW w:w="2900" w:type="dxa"/>
+            <w:shd w:val="clear" w:color="auto" w:fill="DDEBE4"/>
+            <w:vAlign w:val="center"/>
+          </w:tcPr>
+          <w:p>
+            <w:pPr>
+              <w:spacing w:after="0"/>
+            </w:pPr>
+            <w:r>
+              <w:rPr>
+                <w:b/>
+                <w:sz w:val="17"/>
+              </w:rPr>
+              <w:t>UGX 7.6 - 12.4M</w:t>
+            </w:r>
+          </w:p>
+        </w:tc>
+        <w:tc>
+          <w:tcPr>
+            <w:tcW w:w="2482" w:type="dxa"/>
+            <w:shd w:val="clear" w:color="auto" w:fill="DDEBE4"/>
+            <w:vAlign w:val="center"/>
+          </w:tcPr>
+          <w:p>
+            <w:pPr>
+              <w:spacing w:after="0"/>
+            </w:pPr>
+            <w:r>
+              <w:rPr>
+                <w:b/>
+                <w:sz w:val="17"/>
+              </w:rPr>
+              <w:t>UGX 6.3 - 13.3M</w:t>
+            </w:r>
+          </w:p>
+        </w:tc>
+      </w:tr>
+    </w:tbl>
+    <w:p>
+      <w:pPr>
+        <w:jc w:val="center"/>
+      </w:pPr>
+      <w:r>
+        <w:rPr>
+          <w:b/>
+          <w:sz w:val="19"/>
+        </w:rPr>
+        <w:t>UGX 83.4M INVESTED  |  UGX 6.3-13.3M CONTRIBUTED EACH MONTH  |  CAPITAL RECOVERED IN 7 TO 14 MONTHS AT RUN RATE</w:t>
+      </w:r>
+    </w:p>
+    <w:p>
+      <w:r>
+        <w:rPr>
+          <w:b/>
+        </w:rPr>
+        <w:t xml:space="preserve">Two caveats we would rather state than bury. </w:t>
+      </w:r>
+      <w:r>
+        <w:t>First, none of this happens in month one. We would expect two to three months of ramp-up before the lines reach run rate, so measured from the first patient the conservative case is closer to sixteen months than thirteen. Second, these are our own numbers, built from our dispensing and referral records rather than from published benchmarks. We are happy to open those records to you before you commit anything.</w:t>
       </w:r>
     </w:p>
     <w:p>
@@ -408,7 +1652,12 @@
           <w:b/>
           <w:sz w:val="26"/>
         </w:rPr>
-        <w:t>3. WHAT THE FIRST-PHASE INVESTMENT WOULD FUND</w:t>
+        <w:t>6. WHAT COULD GO WRONG</w:t>
+      </w:r>
+    </w:p>
+    <w:p>
+      <w:r>
+        <w:t>A proposal that lists no risks is not being straight with you. These are the six we actually worry about.</w:t>
       </w:r>
     </w:p>
     <w:tbl>
@@ -418,18 +1667,19 @@
         <w:tblLook w:val="04A0" w:firstRow="1" w:lastRow="0" w:firstColumn="1" w:lastColumn="0" w:noHBand="0" w:noVBand="1"/>
       </w:tblPr>
       <w:tblGrid>
-        <w:gridCol w:w="2570"/>
-        <w:gridCol w:w="2570"/>
-        <w:gridCol w:w="2570"/>
-        <w:gridCol w:w="2570"/>
+        <w:gridCol w:w="2400"/>
+        <w:gridCol w:w="3600"/>
+        <w:gridCol w:w="4282"/>
       </w:tblGrid>
       <w:tr>
         <w:trPr>
+          <w:cantSplit/>
+          <w:tblHeader/>
           <w:jc w:val="center"/>
         </w:trPr>
         <w:tc>
           <w:tcPr>
-            <w:tcW w:w="2570" w:type="dxa"/>
+            <w:tcW w:w="2400" w:type="dxa"/>
             <w:shd w:val="clear" w:color="auto" w:fill="165A43"/>
             <w:vAlign w:val="center"/>
           </w:tcPr>
@@ -441,15 +1691,16 @@
             <w:r>
               <w:rPr>
                 <w:b/>
+                <w:color w:val="FFFFFF"/>
                 <w:sz w:val="17"/>
               </w:rPr>
-              <w:t>INVESTMENT AREA</w:t>
+              <w:t>RISK</w:t>
             </w:r>
           </w:p>
         </w:tc>
         <w:tc>
           <w:tcPr>
-            <w:tcW w:w="2570" w:type="dxa"/>
+            <w:tcW w:w="3600" w:type="dxa"/>
             <w:shd w:val="clear" w:color="auto" w:fill="165A43"/>
             <w:vAlign w:val="center"/>
           </w:tcPr>
@@ -461,15 +1712,16 @@
             <w:r>
               <w:rPr>
                 <w:b/>
+                <w:color w:val="FFFFFF"/>
                 <w:sz w:val="17"/>
               </w:rPr>
-              <w:t>PRIORITY RESOURCE GAP</w:t>
+              <w:t>WHY IT MATTERS</w:t>
             </w:r>
           </w:p>
         </w:tc>
         <w:tc>
           <w:tcPr>
-            <w:tcW w:w="2570" w:type="dxa"/>
+            <w:tcW w:w="4282" w:type="dxa"/>
             <w:shd w:val="clear" w:color="auto" w:fill="165A43"/>
             <w:vAlign w:val="center"/>
           </w:tcPr>
@@ -481,29 +1733,10 @@
             <w:r>
               <w:rPr>
                 <w:b/>
+                <w:color w:val="FFFFFF"/>
                 <w:sz w:val="17"/>
               </w:rPr>
-              <w:t>WHAT IT UNLOCKS</w:t>
-            </w:r>
-          </w:p>
-        </w:tc>
-        <w:tc>
-          <w:tcPr>
-            <w:tcW w:w="2570" w:type="dxa"/>
-            <w:shd w:val="clear" w:color="auto" w:fill="165A43"/>
-            <w:vAlign w:val="center"/>
-          </w:tcPr>
-          <w:p>
-            <w:pPr>
-              <w:spacing w:after="0"/>
-              <w:jc w:val="center"/>
-            </w:pPr>
-            <w:r>
-              <w:rPr>
-                <w:b/>
-                <w:sz w:val="17"/>
-              </w:rPr>
-              <w:t>WORKING ESTIMATE</w:t>
+              <w:t>HOW WE WOULD HANDLE IT</w:t>
             </w:r>
           </w:p>
         </w:tc>
@@ -514,7 +1747,7 @@
         </w:trPr>
         <w:tc>
           <w:tcPr>
-            <w:tcW w:w="2570" w:type="dxa"/>
+            <w:tcW w:w="2400" w:type="dxa"/>
             <w:vAlign w:val="center"/>
           </w:tcPr>
           <w:p>
@@ -525,13 +1758,13 @@
               <w:rPr>
                 <w:sz w:val="17"/>
               </w:rPr>
-              <w:t>Pharmacy</w:t>
+              <w:t>Utilisation below assumption</w:t>
             </w:r>
           </w:p>
         </w:tc>
         <w:tc>
           <w:tcPr>
-            <w:tcW w:w="2570" w:type="dxa"/>
+            <w:tcW w:w="3600" w:type="dxa"/>
             <w:vAlign w:val="center"/>
           </w:tcPr>
           <w:p>
@@ -542,13 +1775,13 @@
               <w:rPr>
                 <w:sz w:val="17"/>
               </w:rPr>
-              <w:t>Stock depth, medicines and consumables, storage/working capital, dispensing workflow</w:t>
+              <w:t>The whole case rests on scan and test volumes we have estimated rather than measured</w:t>
             </w:r>
           </w:p>
         </w:tc>
         <w:tc>
           <w:tcPr>
-            <w:tcW w:w="2570" w:type="dxa"/>
+            <w:tcW w:w="4282" w:type="dxa"/>
             <w:vAlign w:val="center"/>
           </w:tcPr>
           <w:p>
@@ -559,13 +1792,18 @@
               <w:rPr>
                 <w:sz w:val="17"/>
               </w:rPr>
-              <w:t>Higher medicine availability, improved patient convenience and stronger pharmacy sales</w:t>
+              <w:t>Release the funds in two tranches, and make the second conditional on three months of actual volumes from the first</w:t>
             </w:r>
           </w:p>
         </w:tc>
+      </w:tr>
+      <w:tr>
+        <w:trPr>
+          <w:jc w:val="center"/>
+        </w:trPr>
         <w:tc>
           <w:tcPr>
-            <w:tcW w:w="2570" w:type="dxa"/>
+            <w:tcW w:w="2400" w:type="dxa"/>
             <w:vAlign w:val="center"/>
           </w:tcPr>
           <w:p>
@@ -576,14 +1814,41 @@
               <w:rPr>
                 <w:sz w:val="17"/>
               </w:rPr>
-              <w:t>UGX 20–25M</w:t>
+              <w:t>Reagent lock-in</w:t>
             </w:r>
+          </w:p>
+        </w:tc>
+        <w:tc>
+          <w:tcPr>
+            <w:tcW w:w="3600" w:type="dxa"/>
+            <w:vAlign w:val="center"/>
+          </w:tcPr>
+          <w:p>
+            <w:pPr>
+              <w:spacing w:after="0"/>
+            </w:pPr>
             <w:r>
               <w:rPr>
                 <w:sz w:val="17"/>
               </w:rPr>
-              <w:br/>
-              <w:t>(stock list &amp; quotations)</w:t>
+              <w:t>Closed-system analysers tie us to one supplier's reagents, and a price rise there comes straight out of the laboratory margin</w:t>
+            </w:r>
+          </w:p>
+        </w:tc>
+        <w:tc>
+          <w:tcPr>
+            <w:tcW w:w="4282" w:type="dxa"/>
+            <w:vAlign w:val="center"/>
+          </w:tcPr>
+          <w:p>
+            <w:pPr>
+              <w:spacing w:after="0"/>
+            </w:pPr>
+            <w:r>
+              <w:rPr>
+                <w:sz w:val="17"/>
+              </w:rPr>
+              <w:t>Agree reagent pricing and lead times with Canon in writing before the purchase order is issued, not after the machines are installed</w:t>
             </w:r>
           </w:p>
         </w:tc>
@@ -594,7 +1859,7 @@
         </w:trPr>
         <w:tc>
           <w:tcPr>
-            <w:tcW w:w="2570" w:type="dxa"/>
+            <w:tcW w:w="2400" w:type="dxa"/>
             <w:vAlign w:val="center"/>
           </w:tcPr>
           <w:p>
@@ -605,13 +1870,13 @@
               <w:rPr>
                 <w:sz w:val="17"/>
               </w:rPr>
-              <w:t>Laboratory</w:t>
+              <w:t>Equipment price movement</w:t>
             </w:r>
           </w:p>
         </w:tc>
         <w:tc>
           <w:tcPr>
-            <w:tcW w:w="2570" w:type="dxa"/>
+            <w:tcW w:w="3600" w:type="dxa"/>
             <w:vAlign w:val="center"/>
           </w:tcPr>
           <w:p>
@@ -622,20 +1887,13 @@
               <w:rPr>
                 <w:sz w:val="17"/>
               </w:rPr>
-              <w:t xml:space="preserve">Diagnostic equipment, reagents/consumables, </w:t>
-            </w:r>
-            <w:r>
-              <w:rPr>
-                <w:sz w:val="17"/>
-              </w:rPr>
-              <w:lastRenderedPageBreak/>
-              <w:t>service/maintenance and workflow setup</w:t>
+              <w:t>The proforma has lapsed and the shilling moves against the dollar</w:t>
             </w:r>
           </w:p>
         </w:tc>
         <w:tc>
           <w:tcPr>
-            <w:tcW w:w="2570" w:type="dxa"/>
+            <w:tcW w:w="4282" w:type="dxa"/>
             <w:vAlign w:val="center"/>
           </w:tcPr>
           <w:p>
@@ -646,21 +1904,18 @@
               <w:rPr>
                 <w:sz w:val="17"/>
               </w:rPr>
-              <w:lastRenderedPageBreak/>
-              <w:t xml:space="preserve">Broader in-house testing, faster results and reduced </w:t>
-            </w:r>
-            <w:r>
-              <w:rPr>
-                <w:sz w:val="17"/>
-              </w:rPr>
-              <w:lastRenderedPageBreak/>
-              <w:t>dependence on external facilities</w:t>
+              <w:t>Re-confirm pricing immediately before ordering. The 8% contingency is carried in the budget for exactly this</w:t>
             </w:r>
           </w:p>
         </w:tc>
+      </w:tr>
+      <w:tr>
+        <w:trPr>
+          <w:jc w:val="center"/>
+        </w:trPr>
         <w:tc>
           <w:tcPr>
-            <w:tcW w:w="2570" w:type="dxa"/>
+            <w:tcW w:w="2400" w:type="dxa"/>
             <w:vAlign w:val="center"/>
           </w:tcPr>
           <w:p>
@@ -671,15 +1926,41 @@
               <w:rPr>
                 <w:sz w:val="17"/>
               </w:rPr>
-              <w:lastRenderedPageBreak/>
-              <w:t>UGX 25–35M</w:t>
+              <w:t>Losing the sonographer</w:t>
             </w:r>
+          </w:p>
+        </w:tc>
+        <w:tc>
+          <w:tcPr>
+            <w:tcW w:w="3600" w:type="dxa"/>
+            <w:vAlign w:val="center"/>
+          </w:tcPr>
+          <w:p>
+            <w:pPr>
+              <w:spacing w:after="0"/>
+            </w:pPr>
             <w:r>
               <w:rPr>
                 <w:sz w:val="17"/>
               </w:rPr>
-              <w:br/>
-              <w:t>(equipment plan &amp; quotations)</w:t>
+              <w:t>Sonographers are scarce in Kampala and move for small increases</w:t>
+            </w:r>
+          </w:p>
+        </w:tc>
+        <w:tc>
+          <w:tcPr>
+            <w:tcW w:w="4282" w:type="dxa"/>
+            <w:vAlign w:val="center"/>
+          </w:tcPr>
+          <w:p>
+            <w:pPr>
+              <w:spacing w:after="0"/>
+            </w:pPr>
+            <w:r>
+              <w:rPr>
+                <w:sz w:val="17"/>
+              </w:rPr>
+              <w:t>Written notice terms in the contract, and a second operator cross-trained from existing clinical staff so the service does not stop</w:t>
             </w:r>
           </w:p>
         </w:tc>
@@ -690,7 +1971,7 @@
         </w:trPr>
         <w:tc>
           <w:tcPr>
-            <w:tcW w:w="2570" w:type="dxa"/>
+            <w:tcW w:w="2400" w:type="dxa"/>
             <w:vAlign w:val="center"/>
           </w:tcPr>
           <w:p>
@@ -701,13 +1982,13 @@
               <w:rPr>
                 <w:sz w:val="17"/>
               </w:rPr>
-              <w:t>Radiology</w:t>
+              <w:t>Power interruption</w:t>
             </w:r>
           </w:p>
         </w:tc>
         <w:tc>
           <w:tcPr>
-            <w:tcW w:w="2570" w:type="dxa"/>
+            <w:tcW w:w="3600" w:type="dxa"/>
             <w:vAlign w:val="center"/>
           </w:tcPr>
           <w:p>
@@ -718,13 +1999,13 @@
               <w:rPr>
                 <w:sz w:val="17"/>
               </w:rPr>
-              <w:t>Imaging equipment, room readiness, power/protection, workflow and commissioning</w:t>
+              <w:t>Analysers are intolerant of unstable or interrupted supply, and a spoiled run wastes reagent</w:t>
             </w:r>
           </w:p>
         </w:tc>
         <w:tc>
           <w:tcPr>
-            <w:tcW w:w="2570" w:type="dxa"/>
+            <w:tcW w:w="4282" w:type="dxa"/>
             <w:vAlign w:val="center"/>
           </w:tcPr>
           <w:p>
@@ -735,13 +2016,18 @@
               <w:rPr>
                 <w:sz w:val="17"/>
               </w:rPr>
-              <w:t>In-house imaging capacity, faster diagnosis and an additional billable service line</w:t>
+              <w:t>Stabilisers are already in the equipment order, and UPS and inverter cover sits as a separate budget line</w:t>
             </w:r>
           </w:p>
         </w:tc>
+      </w:tr>
+      <w:tr>
+        <w:trPr>
+          <w:jc w:val="center"/>
+        </w:trPr>
         <w:tc>
           <w:tcPr>
-            <w:tcW w:w="2570" w:type="dxa"/>
+            <w:tcW w:w="2400" w:type="dxa"/>
             <w:vAlign w:val="center"/>
           </w:tcPr>
           <w:p>
@@ -752,25 +2038,13 @@
               <w:rPr>
                 <w:sz w:val="17"/>
               </w:rPr>
-              <w:t>UGX 20–30M</w:t>
-            </w:r>
-            <w:r>
-              <w:rPr>
-                <w:sz w:val="17"/>
-              </w:rPr>
-              <w:br/>
-              <w:t>(modality &amp; quotations)</w:t>
+              <w:t>Regulatory delay</w:t>
             </w:r>
           </w:p>
         </w:tc>
-      </w:tr>
-      <w:tr>
-        <w:trPr>
-          <w:jc w:val="center"/>
-        </w:trPr>
         <w:tc>
           <w:tcPr>
-            <w:tcW w:w="2570" w:type="dxa"/>
+            <w:tcW w:w="3600" w:type="dxa"/>
             <w:vAlign w:val="center"/>
           </w:tcPr>
           <w:p>
@@ -781,13 +2055,13 @@
               <w:rPr>
                 <w:sz w:val="17"/>
               </w:rPr>
-              <w:t>Launch &amp; working capital</w:t>
+              <w:t>Practitioner registration and premises compliance take time and can stall a launch after the money is spent</w:t>
             </w:r>
           </w:p>
         </w:tc>
         <w:tc>
           <w:tcPr>
-            <w:tcW w:w="2570" w:type="dxa"/>
+            <w:tcW w:w="4282" w:type="dxa"/>
             <w:vAlign w:val="center"/>
           </w:tcPr>
           <w:p>
@@ -798,280 +2072,7 @@
               <w:rPr>
                 <w:sz w:val="17"/>
               </w:rPr>
-              <w:t>Staffing/onboarding, initial supplies, utilities, marketing and opening support</w:t>
-            </w:r>
-          </w:p>
-        </w:tc>
-        <w:tc>
-          <w:tcPr>
-            <w:tcW w:w="2570" w:type="dxa"/>
-            <w:vAlign w:val="center"/>
-          </w:tcPr>
-          <w:p>
-            <w:pPr>
-              <w:spacing w:after="0"/>
-            </w:pPr>
-            <w:r>
-              <w:rPr>
-                <w:sz w:val="17"/>
-              </w:rPr>
-              <w:t>Safe operational launch and early utilisation build-up</w:t>
-            </w:r>
-          </w:p>
-        </w:tc>
-        <w:tc>
-          <w:tcPr>
-            <w:tcW w:w="2570" w:type="dxa"/>
-            <w:vAlign w:val="center"/>
-          </w:tcPr>
-          <w:p>
-            <w:pPr>
-              <w:spacing w:after="0"/>
-            </w:pPr>
-            <w:r>
-              <w:rPr>
-                <w:sz w:val="17"/>
-              </w:rPr>
-              <w:t>UGX 10M</w:t>
-            </w:r>
-            <w:r>
-              <w:rPr>
-                <w:sz w:val="17"/>
-              </w:rPr>
-              <w:br/>
-              <w:t>(implementation plan)</w:t>
-            </w:r>
-          </w:p>
-        </w:tc>
-      </w:tr>
-    </w:tbl>
-    <w:p>
-      <w:r>
-        <w:rPr>
-          <w:b/>
-        </w:rPr>
-        <w:t xml:space="preserve">Funding principle: </w:t>
-      </w:r>
-      <w:r>
-        <w:t>Because pharmacy, laboratory and radiology each involve different equipment, stock lines and suppliers, FairBanks has set a working investment envelope of UGX 75–100M covering all four resource gaps above. This range will be firmed up into a validated one-page budget once each requirement is priced through supplier quotations.</w:t>
-      </w:r>
-    </w:p>
-    <w:p>
-      <w:r>
-        <w:rPr>
-          <w:b/>
-        </w:rPr>
-        <w:t xml:space="preserve">Important: </w:t>
-      </w:r>
-      <w:r>
-        <w:t>The line-item figures above are a preliminary planning estimate, not supplier quotations or an audited budget. Final costs should be confirmed through equipment specifications, stock lists, supplier quotations and a detailed implementation plan before investment commitment.</w:t>
-      </w:r>
-    </w:p>
-    <w:p>
-      <w:pPr>
-        <w:spacing w:before="160" w:after="60"/>
-      </w:pPr>
-      <w:r>
-        <w:rPr>
-          <w:b/>
-          <w:sz w:val="26"/>
-        </w:rPr>
-        <w:t>4. PROPOSED INVESTMENT PHASING</w:t>
-      </w:r>
-    </w:p>
-    <w:tbl>
-      <w:tblPr>
-        <w:tblW w:w="0" w:type="auto"/>
-        <w:jc w:val="center"/>
-        <w:tblLook w:val="04A0" w:firstRow="1" w:lastRow="0" w:firstColumn="1" w:lastColumn="0" w:noHBand="0" w:noVBand="1"/>
-      </w:tblPr>
-      <w:tblGrid>
-        <w:gridCol w:w="2570"/>
-        <w:gridCol w:w="2570"/>
-        <w:gridCol w:w="2570"/>
-        <w:gridCol w:w="2570"/>
-      </w:tblGrid>
-      <w:tr>
-        <w:trPr>
-          <w:jc w:val="center"/>
-        </w:trPr>
-        <w:tc>
-          <w:tcPr>
-            <w:tcW w:w="2570" w:type="dxa"/>
-            <w:shd w:val="clear" w:color="auto" w:fill="F4F0E7"/>
-          </w:tcPr>
-          <w:p>
-            <w:pPr>
-              <w:jc w:val="center"/>
-            </w:pPr>
-            <w:r>
-              <w:rPr>
-                <w:b/>
-                <w:sz w:val="28"/>
-              </w:rPr>
-              <w:t>1</w:t>
-            </w:r>
-            <w:r>
-              <w:rPr>
-                <w:b/>
-                <w:sz w:val="28"/>
-              </w:rPr>
-              <w:br/>
-            </w:r>
-            <w:r>
-              <w:rPr>
-                <w:b/>
-                <w:sz w:val="18"/>
-              </w:rPr>
-              <w:t>SCOPE</w:t>
-            </w:r>
-            <w:r>
-              <w:rPr>
-                <w:b/>
-                <w:sz w:val="18"/>
-              </w:rPr>
-              <w:br/>
-            </w:r>
-            <w:r>
-              <w:rPr>
-                <w:sz w:val="16"/>
-              </w:rPr>
-              <w:t>Confirm exact gaps, specifications and priorities for pharmacy, laboratory and radiology.</w:t>
-            </w:r>
-          </w:p>
-        </w:tc>
-        <w:tc>
-          <w:tcPr>
-            <w:tcW w:w="2570" w:type="dxa"/>
-            <w:shd w:val="clear" w:color="auto" w:fill="F4F0E7"/>
-          </w:tcPr>
-          <w:p>
-            <w:pPr>
-              <w:jc w:val="center"/>
-            </w:pPr>
-            <w:r>
-              <w:rPr>
-                <w:b/>
-                <w:sz w:val="28"/>
-              </w:rPr>
-              <w:t>2</w:t>
-            </w:r>
-            <w:r>
-              <w:rPr>
-                <w:b/>
-                <w:sz w:val="28"/>
-              </w:rPr>
-              <w:br/>
-            </w:r>
-            <w:r>
-              <w:rPr>
-                <w:b/>
-                <w:sz w:val="18"/>
-              </w:rPr>
-              <w:t>PRICE</w:t>
-            </w:r>
-            <w:r>
-              <w:rPr>
-                <w:b/>
-                <w:sz w:val="18"/>
-              </w:rPr>
-              <w:br/>
-            </w:r>
-            <w:r>
-              <w:rPr>
-                <w:sz w:val="16"/>
-              </w:rPr>
-              <w:t>Obtain supplier quotations and prepare a consolidated capital + opening working-capital budget.</w:t>
-            </w:r>
-          </w:p>
-        </w:tc>
-        <w:tc>
-          <w:tcPr>
-            <w:tcW w:w="2570" w:type="dxa"/>
-            <w:shd w:val="clear" w:color="auto" w:fill="F4F0E7"/>
-          </w:tcPr>
-          <w:p>
-            <w:pPr>
-              <w:jc w:val="center"/>
-            </w:pPr>
-            <w:r>
-              <w:rPr>
-                <w:b/>
-                <w:sz w:val="28"/>
-              </w:rPr>
-              <w:t>3</w:t>
-            </w:r>
-            <w:r>
-              <w:rPr>
-                <w:b/>
-                <w:sz w:val="28"/>
-              </w:rPr>
-              <w:br/>
-            </w:r>
-            <w:r>
-              <w:rPr>
-                <w:b/>
-                <w:sz w:val="18"/>
-              </w:rPr>
-              <w:t>DEPLOY</w:t>
-            </w:r>
-            <w:r>
-              <w:rPr>
-                <w:b/>
-                <w:sz w:val="18"/>
-              </w:rPr>
-              <w:br/>
-            </w:r>
-            <w:r>
-              <w:rPr>
-                <w:sz w:val="16"/>
-              </w:rPr>
-              <w:t>Procure, install, stock, recruit/onboard and commission the selected services.</w:t>
-            </w:r>
-          </w:p>
-        </w:tc>
-        <w:tc>
-          <w:tcPr>
-            <w:tcW w:w="2570" w:type="dxa"/>
-            <w:shd w:val="clear" w:color="auto" w:fill="F4F0E7"/>
-          </w:tcPr>
-          <w:p>
-            <w:pPr>
-              <w:jc w:val="center"/>
-            </w:pPr>
-            <w:r>
-              <w:rPr>
-                <w:b/>
-                <w:sz w:val="28"/>
-              </w:rPr>
-              <w:t>4</w:t>
-            </w:r>
-            <w:r>
-              <w:rPr>
-                <w:b/>
-                <w:sz w:val="28"/>
-              </w:rPr>
-              <w:br/>
-            </w:r>
-            <w:r>
-              <w:rPr>
-                <w:b/>
-                <w:sz w:val="18"/>
-              </w:rPr>
-              <w:t>MEASURE</w:t>
-            </w:r>
-            <w:r>
-              <w:rPr>
-                <w:b/>
-                <w:sz w:val="18"/>
-              </w:rPr>
-              <w:br/>
-            </w:r>
-            <w:r>
-              <w:rPr>
-                <w:sz w:val="16"/>
-              </w:rPr>
-              <w:t>Track utilisation, revenue, direct costs, turnaround times and monthly contribution.</w:t>
+              <w:t>Racheal handles these relationships directly through UMDPC, the Allied Health Council and NDA, and would start them in parallel with procurement</w:t>
             </w:r>
           </w:p>
         </w:tc>
@@ -1086,393 +2087,12 @@
           <w:b/>
           <w:sz w:val="26"/>
         </w:rPr>
-        <w:t>5. THE COMMERCIAL MODEL</w:t>
+        <w:t>7. HOW YOUR INVESTMENT COULD BE STRUCTURED</w:t>
       </w:r>
     </w:p>
     <w:p>
       <w:r>
-        <w:t>The investment case should be measured at service-line level. Rather than relying on broad facility assumptions, FairBanks can report the performance of each component monthly and use the combined contribution to assess capital recovery.</w:t>
-      </w:r>
-    </w:p>
-    <w:tbl>
-      <w:tblPr>
-        <w:tblW w:w="0" w:type="auto"/>
-        <w:jc w:val="center"/>
-        <w:tblLook w:val="04A0" w:firstRow="1" w:lastRow="0" w:firstColumn="1" w:lastColumn="0" w:noHBand="0" w:noVBand="1"/>
-      </w:tblPr>
-      <w:tblGrid>
-        <w:gridCol w:w="3427"/>
-        <w:gridCol w:w="3427"/>
-        <w:gridCol w:w="3427"/>
-      </w:tblGrid>
-      <w:tr>
-        <w:trPr>
-          <w:jc w:val="center"/>
-        </w:trPr>
-        <w:tc>
-          <w:tcPr>
-            <w:tcW w:w="3427" w:type="dxa"/>
-            <w:shd w:val="clear" w:color="auto" w:fill="165A43"/>
-            <w:vAlign w:val="center"/>
-          </w:tcPr>
-          <w:p>
-            <w:pPr>
-              <w:spacing w:after="0"/>
-              <w:jc w:val="center"/>
-            </w:pPr>
-            <w:r>
-              <w:rPr>
-                <w:b/>
-                <w:sz w:val="17"/>
-              </w:rPr>
-              <w:t>INDICATOR</w:t>
-            </w:r>
-          </w:p>
-        </w:tc>
-        <w:tc>
-          <w:tcPr>
-            <w:tcW w:w="3427" w:type="dxa"/>
-            <w:shd w:val="clear" w:color="auto" w:fill="165A43"/>
-            <w:vAlign w:val="center"/>
-          </w:tcPr>
-          <w:p>
-            <w:pPr>
-              <w:spacing w:after="0"/>
-              <w:jc w:val="center"/>
-            </w:pPr>
-            <w:r>
-              <w:rPr>
-                <w:b/>
-                <w:sz w:val="17"/>
-              </w:rPr>
-              <w:t>MEASUREMENT</w:t>
-            </w:r>
-          </w:p>
-        </w:tc>
-        <w:tc>
-          <w:tcPr>
-            <w:tcW w:w="3427" w:type="dxa"/>
-            <w:shd w:val="clear" w:color="auto" w:fill="165A43"/>
-            <w:vAlign w:val="center"/>
-          </w:tcPr>
-          <w:p>
-            <w:pPr>
-              <w:spacing w:after="0"/>
-              <w:jc w:val="center"/>
-            </w:pPr>
-            <w:r>
-              <w:rPr>
-                <w:b/>
-                <w:sz w:val="17"/>
-              </w:rPr>
-              <w:t>INVESTOR USE</w:t>
-            </w:r>
-          </w:p>
-        </w:tc>
-      </w:tr>
-      <w:tr>
-        <w:trPr>
-          <w:jc w:val="center"/>
-        </w:trPr>
-        <w:tc>
-          <w:tcPr>
-            <w:tcW w:w="3427" w:type="dxa"/>
-            <w:vAlign w:val="center"/>
-          </w:tcPr>
-          <w:p>
-            <w:pPr>
-              <w:spacing w:after="0"/>
-            </w:pPr>
-            <w:r>
-              <w:rPr>
-                <w:sz w:val="17"/>
-              </w:rPr>
-              <w:t>Pharmacy revenue</w:t>
-            </w:r>
-          </w:p>
-        </w:tc>
-        <w:tc>
-          <w:tcPr>
-            <w:tcW w:w="3427" w:type="dxa"/>
-            <w:vAlign w:val="center"/>
-          </w:tcPr>
-          <w:p>
-            <w:pPr>
-              <w:spacing w:after="0"/>
-            </w:pPr>
-            <w:r>
-              <w:rPr>
-                <w:sz w:val="17"/>
-              </w:rPr>
-              <w:t>Monthly medicine and consumables sales</w:t>
-            </w:r>
-          </w:p>
-        </w:tc>
-        <w:tc>
-          <w:tcPr>
-            <w:tcW w:w="3427" w:type="dxa"/>
-            <w:vAlign w:val="center"/>
-          </w:tcPr>
-          <w:p>
-            <w:pPr>
-              <w:spacing w:after="0"/>
-            </w:pPr>
-            <w:r>
-              <w:rPr>
-                <w:sz w:val="17"/>
-              </w:rPr>
-              <w:t>Shows direct sales generated by the funded stock/working capital</w:t>
-            </w:r>
-          </w:p>
-        </w:tc>
-      </w:tr>
-      <w:tr>
-        <w:trPr>
-          <w:jc w:val="center"/>
-        </w:trPr>
-        <w:tc>
-          <w:tcPr>
-            <w:tcW w:w="3427" w:type="dxa"/>
-            <w:vAlign w:val="center"/>
-          </w:tcPr>
-          <w:p>
-            <w:pPr>
-              <w:spacing w:after="0"/>
-            </w:pPr>
-            <w:r>
-              <w:rPr>
-                <w:sz w:val="17"/>
-              </w:rPr>
-              <w:t>Laboratory revenue</w:t>
-            </w:r>
-          </w:p>
-        </w:tc>
-        <w:tc>
-          <w:tcPr>
-            <w:tcW w:w="3427" w:type="dxa"/>
-            <w:vAlign w:val="center"/>
-          </w:tcPr>
-          <w:p>
-            <w:pPr>
-              <w:spacing w:after="0"/>
-            </w:pPr>
-            <w:r>
-              <w:rPr>
-                <w:sz w:val="17"/>
-              </w:rPr>
-              <w:t>Monthly tests performed × applicable price</w:t>
-            </w:r>
-          </w:p>
-        </w:tc>
-        <w:tc>
-          <w:tcPr>
-            <w:tcW w:w="3427" w:type="dxa"/>
-            <w:vAlign w:val="center"/>
-          </w:tcPr>
-          <w:p>
-            <w:pPr>
-              <w:spacing w:after="0"/>
-            </w:pPr>
-            <w:r>
-              <w:rPr>
-                <w:sz w:val="17"/>
-              </w:rPr>
-              <w:t>Shows utilisation and diagnostic contribution</w:t>
-            </w:r>
-          </w:p>
-        </w:tc>
-      </w:tr>
-      <w:tr>
-        <w:trPr>
-          <w:jc w:val="center"/>
-        </w:trPr>
-        <w:tc>
-          <w:tcPr>
-            <w:tcW w:w="3427" w:type="dxa"/>
-            <w:vAlign w:val="center"/>
-          </w:tcPr>
-          <w:p>
-            <w:pPr>
-              <w:spacing w:after="0"/>
-            </w:pPr>
-            <w:r>
-              <w:rPr>
-                <w:sz w:val="17"/>
-              </w:rPr>
-              <w:t>Radiology revenue</w:t>
-            </w:r>
-          </w:p>
-        </w:tc>
-        <w:tc>
-          <w:tcPr>
-            <w:tcW w:w="3427" w:type="dxa"/>
-            <w:vAlign w:val="center"/>
-          </w:tcPr>
-          <w:p>
-            <w:pPr>
-              <w:spacing w:after="0"/>
-            </w:pPr>
-            <w:r>
-              <w:rPr>
-                <w:sz w:val="17"/>
-              </w:rPr>
-              <w:t>Monthly imaging procedures × applicable price</w:t>
-            </w:r>
-          </w:p>
-        </w:tc>
-        <w:tc>
-          <w:tcPr>
-            <w:tcW w:w="3427" w:type="dxa"/>
-            <w:vAlign w:val="center"/>
-          </w:tcPr>
-          <w:p>
-            <w:pPr>
-              <w:spacing w:after="0"/>
-            </w:pPr>
-            <w:r>
-              <w:rPr>
-                <w:sz w:val="17"/>
-              </w:rPr>
-              <w:t>Shows utilisation and new service-line revenue</w:t>
-            </w:r>
-          </w:p>
-        </w:tc>
-      </w:tr>
-      <w:tr>
-        <w:trPr>
-          <w:jc w:val="center"/>
-        </w:trPr>
-        <w:tc>
-          <w:tcPr>
-            <w:tcW w:w="3427" w:type="dxa"/>
-            <w:vAlign w:val="center"/>
-          </w:tcPr>
-          <w:p>
-            <w:pPr>
-              <w:spacing w:after="0"/>
-            </w:pPr>
-            <w:r>
-              <w:rPr>
-                <w:sz w:val="17"/>
-              </w:rPr>
-              <w:t>Direct operating costs</w:t>
-            </w:r>
-          </w:p>
-        </w:tc>
-        <w:tc>
-          <w:tcPr>
-            <w:tcW w:w="3427" w:type="dxa"/>
-            <w:vAlign w:val="center"/>
-          </w:tcPr>
-          <w:p>
-            <w:pPr>
-              <w:spacing w:after="0"/>
-            </w:pPr>
-            <w:r>
-              <w:rPr>
-                <w:sz w:val="17"/>
-              </w:rPr>
-              <w:t>Stock, reagents, consumables, utilities, service and staffing costs</w:t>
-            </w:r>
-          </w:p>
-        </w:tc>
-        <w:tc>
-          <w:tcPr>
-            <w:tcW w:w="3427" w:type="dxa"/>
-            <w:vAlign w:val="center"/>
-          </w:tcPr>
-          <w:p>
-            <w:pPr>
-              <w:spacing w:after="0"/>
-            </w:pPr>
-            <w:r>
-              <w:rPr>
-                <w:sz w:val="17"/>
-              </w:rPr>
-              <w:t>Determines contribution available for capital recovery</w:t>
-            </w:r>
-          </w:p>
-        </w:tc>
-      </w:tr>
-      <w:tr>
-        <w:trPr>
-          <w:jc w:val="center"/>
-        </w:trPr>
-        <w:tc>
-          <w:tcPr>
-            <w:tcW w:w="3427" w:type="dxa"/>
-            <w:vAlign w:val="center"/>
-          </w:tcPr>
-          <w:p>
-            <w:pPr>
-              <w:spacing w:after="0"/>
-            </w:pPr>
-            <w:r>
-              <w:rPr>
-                <w:sz w:val="17"/>
-              </w:rPr>
-              <w:t>Monthly project contribution</w:t>
-            </w:r>
-          </w:p>
-        </w:tc>
-        <w:tc>
-          <w:tcPr>
-            <w:tcW w:w="3427" w:type="dxa"/>
-            <w:vAlign w:val="center"/>
-          </w:tcPr>
-          <w:p>
-            <w:pPr>
-              <w:spacing w:after="0"/>
-            </w:pPr>
-            <w:r>
-              <w:rPr>
-                <w:sz w:val="17"/>
-              </w:rPr>
-              <w:t>Combined revenue less incremental operating costs</w:t>
-            </w:r>
-          </w:p>
-        </w:tc>
-        <w:tc>
-          <w:tcPr>
-            <w:tcW w:w="3427" w:type="dxa"/>
-            <w:vAlign w:val="center"/>
-          </w:tcPr>
-          <w:p>
-            <w:pPr>
-              <w:spacing w:after="0"/>
-            </w:pPr>
-            <w:r>
-              <w:rPr>
-                <w:sz w:val="17"/>
-              </w:rPr>
-              <w:t>Basis for agreed investor repayment/return</w:t>
-            </w:r>
-          </w:p>
-        </w:tc>
-      </w:tr>
-    </w:tbl>
-    <w:p>
-      <w:pPr>
-        <w:jc w:val="center"/>
-      </w:pPr>
-      <w:r>
-        <w:rPr>
-          <w:b/>
-          <w:sz w:val="19"/>
-        </w:rPr>
-        <w:t>CORE INVESTMENT PRINCIPLE: FUND THE ASSETS AND WORKING CAPITAL → LAUNCH → MEASURE CONTRIBUTION → RECOVER CAPITAL UNDER AN AGREED FORMULA.</w:t>
-      </w:r>
-    </w:p>
-    <w:p>
-      <w:pPr>
-        <w:spacing w:before="160" w:after="60"/>
-      </w:pPr>
-      <w:r>
-        <w:rPr>
-          <w:b/>
-          <w:sz w:val="26"/>
-        </w:rPr>
-        <w:t>6. HOW YOU CAN BENEFIT</w:t>
+        <w:t>We have deliberately not assumed a structure. Three would work for us, and we are open to a fourth if you would prefer something else.</w:t>
       </w:r>
     </w:p>
     <w:p>
@@ -1484,10 +2104,10 @@
         <w:rPr>
           <w:b/>
         </w:rPr>
-        <w:t xml:space="preserve">Project-based return: </w:t>
+        <w:t xml:space="preserve">A project loan with an agreed return. </w:t>
       </w:r>
       <w:r>
-        <w:t>Finance the three-service expansion as a defined investment project and agree a transparent repayment/return mechanism tied to project cash generation.</w:t>
+        <w:t>You advance the capital and we repay it out of the monthly contribution over an agreed period at an agreed premium. Simplest to document, and cleanest for you to exit.</w:t>
       </w:r>
     </w:p>
     <w:p>
@@ -1499,66 +2119,30 @@
         <w:rPr>
           <w:b/>
         </w:rPr>
-        <w:t xml:space="preserve">Capital recovery: </w:t>
+        <w:t xml:space="preserve">A revenue share on the funded lines. </w:t>
       </w:r>
       <w:r>
-        <w:t>Allocate an agreed portion of the pharmacy, laboratory and radiology contribution toward recovering the invested capital over an agreed period.</w:t>
+        <w:t>You take an agreed percentage of the ultrasound, laboratory and pharmacy contribution until capital and return are recovered, after which the share steps down or ends. Your return then tracks performance in both directions.</w:t>
       </w:r>
     </w:p>
     <w:p>
       <w:pPr>
-        <w:spacing w:after="40"/>
+        <w:spacing w:after="200"/>
         <w:ind w:left="216"/>
       </w:pPr>
       <w:r>
         <w:rPr>
           <w:b/>
         </w:rPr>
-        <w:t xml:space="preserve">Diversified upside: </w:t>
+        <w:t xml:space="preserve">Equity in the expansion. </w:t>
       </w:r>
       <w:r>
-        <w:t>Participation in three complementary service lines can reduce reliance on a single revenue source.</w:t>
-      </w:r>
-    </w:p>
-    <w:p>
-      <w:pPr>
-        <w:spacing w:after="40"/>
-        <w:ind w:left="216"/>
-      </w:pPr>
-      <w:r>
-        <w:rPr>
-          <w:b/>
-        </w:rPr>
-        <w:t xml:space="preserve">Longer-term participation: </w:t>
-      </w:r>
-      <w:r>
-        <w:t>Where appropriate, the arrangement may combine capital recovery with a pre-agreed return premium or equity participation.</w:t>
-      </w:r>
-    </w:p>
-    <w:p>
-      <w:pPr>
-        <w:spacing w:before="160" w:after="60"/>
-      </w:pPr>
-      <w:r>
-        <w:rPr>
-          <w:b/>
-          <w:sz w:val="26"/>
-        </w:rPr>
-        <w:lastRenderedPageBreak/>
-        <w:t>7. RISK CONTROL &amp; TRANSPARENCY</w:t>
+        <w:t>A shareholding negotiated on valuation, if you would rather hold a long position in FairBanks than simply be repaid.</w:t>
       </w:r>
     </w:p>
     <w:p>
       <w:r>
-        <w:t>The investment should be ring-fenced, documented and reported against a simple monthly dashboard. FairBanks can separate the funded service lines from the rest of the facility for performance monitoring. Procurement should be supported by quotations, and all major capital items should be clearly documented before funds are released.</w:t>
-      </w:r>
-    </w:p>
-    <w:p>
-      <w:pPr>
-        <w:keepNext/>
-      </w:pPr>
-      <w:r>
-        <w:t>Once launched, performance will be reported monthly against a simple dashboard using this format:</w:t>
+        <w:t>Whichever we settle on, the funded lines would be reported separately from the rest of the facility, every month, on a single page: capital drawn, procedures performed, revenue, direct costs, contribution and cumulative recovery. You would be looking at the same numbers we are, on the same day.</w:t>
       </w:r>
     </w:p>
     <w:tbl>
@@ -1571,7 +2155,7 @@
         <w:gridCol w:w="2570"/>
         <w:gridCol w:w="2570"/>
         <w:gridCol w:w="2570"/>
-        <w:gridCol w:w="2570"/>
+        <w:gridCol w:w="2572"/>
       </w:tblGrid>
       <w:tr>
         <w:trPr>
@@ -1595,7 +2179,7 @@
                 <w:b/>
                 <w:sz w:val="18"/>
               </w:rPr>
-              <w:t>CAPITAL DEPLOYED</w:t>
+              <w:t>CAPITAL DRAWN</w:t>
             </w:r>
           </w:p>
         </w:tc>
@@ -1615,7 +2199,7 @@
                 <w:b/>
                 <w:sz w:val="18"/>
               </w:rPr>
-              <w:t>UTILISATION</w:t>
+              <w:t>PROCEDURES DONE</w:t>
             </w:r>
           </w:p>
         </w:tc>
@@ -1635,13 +2219,13 @@
                 <w:b/>
                 <w:sz w:val="18"/>
               </w:rPr>
-              <w:t>REVENUE</w:t>
+              <w:t>REVENUE &amp; COSTS</w:t>
             </w:r>
           </w:p>
         </w:tc>
         <w:tc>
           <w:tcPr>
-            <w:tcW w:w="2570" w:type="dxa"/>
+            <w:tcW w:w="2572" w:type="dxa"/>
             <w:shd w:val="clear" w:color="auto" w:fill="DDEBE4"/>
             <w:vAlign w:val="center"/>
           </w:tcPr>
@@ -1655,7 +2239,125 @@
                 <w:b/>
                 <w:sz w:val="18"/>
               </w:rPr>
-              <w:t>CONTRIBUTION</w:t>
+              <w:t>CUMULATIVE RECOVERY</w:t>
+            </w:r>
+          </w:p>
+        </w:tc>
+      </w:tr>
+    </w:tbl>
+    <w:p>
+      <w:r/>
+    </w:p>
+    <w:p>
+      <w:pPr>
+        <w:spacing w:before="160" w:after="60"/>
+      </w:pPr>
+      <w:r>
+        <w:rPr>
+          <w:b/>
+          <w:sz w:val="26"/>
+        </w:rPr>
+        <w:t>8. WHAT WE ARE ASKING FOR</w:t>
+      </w:r>
+    </w:p>
+    <w:p>
+      <w:pPr>
+        <w:spacing w:after="20"/>
+        <w:ind w:left="288"/>
+      </w:pPr>
+      <w:r>
+        <w:t>• One conversation at the centre, so you can see the room, the pharmacy and the laboratory bench before you form a view.</w:t>
+      </w:r>
+    </w:p>
+    <w:p>
+      <w:pPr>
+        <w:spacing w:after="20"/>
+        <w:ind w:left="288"/>
+      </w:pPr>
+      <w:r>
+        <w:t>• An indication of the capital you would be comfortable placing. If UGX 83.4M is more than you want to commit at once, the equipment order stands perfectly well on its own at UGX 29.9M, and reagents and pharmacy stock can follow out of what it earns.</w:t>
+      </w:r>
+    </w:p>
+    <w:p>
+      <w:pPr>
+        <w:spacing w:after="20"/>
+        <w:ind w:left="288"/>
+      </w:pPr>
+      <w:r>
+        <w:t>• If the conversation goes well, we turn this into a one-page deployment budget and an agreed structure within two weeks of your indication.</w:t>
+      </w:r>
+    </w:p>
+    <w:p>
+      <w:pPr>
+        <w:spacing w:before="120"/>
+      </w:pPr>
+      <w:r>
+        <w:t>We are not asking for an open-ended injection into the business. We are asking you to fund a defined list of equipment and stock, and then to hold us to the numbers it produces.</w:t>
+      </w:r>
+    </w:p>
+    <w:p>
+      <w:pPr>
+        <w:spacing w:before="240"/>
+        <w:jc w:val="center"/>
+      </w:pPr>
+      <w:r>
+        <w:rPr>
+          <w:b/>
+          <w:sz w:val="24"/>
+        </w:rPr>
+        <w:t>FINISH THE DIAGNOSIS UNDER ONE ROOF.</w:t>
+      </w:r>
+    </w:p>
+    <w:tbl>
+      <w:tblPr>
+        <w:tblW w:w="0" w:type="auto"/>
+        <w:jc w:val="center"/>
+        <w:tblLook w:val="04A0" w:firstRow="1" w:lastRow="0" w:firstColumn="1" w:lastColumn="0" w:noHBand="0" w:noVBand="1"/>
+      </w:tblPr>
+      <w:tblGrid>
+        <w:gridCol w:w="10282"/>
+      </w:tblGrid>
+      <w:tr>
+        <w:trPr>
+          <w:jc w:val="center"/>
+        </w:trPr>
+        <w:tc>
+          <w:tcPr>
+            <w:tcW w:w="10282" w:type="dxa"/>
+            <w:shd w:val="clear" w:color="auto" w:fill="F4F0E7"/>
+            <w:vAlign w:val="center"/>
+          </w:tcPr>
+          <w:p>
+            <w:pPr>
+              <w:spacing w:after="0"/>
+            </w:pPr>
+            <w:r>
+              <w:rPr>
+                <w:b/>
+              </w:rPr>
+              <w:t>Racheal Nabukeera</w:t>
+            </w:r>
+          </w:p>
+          <w:p>
+            <w:pPr>
+              <w:spacing w:after="0"/>
+            </w:pPr>
+            <w:r>
+              <w:rPr>
+                <w:sz w:val="18"/>
+              </w:rPr>
+              <w:t>Managing Director and Co-founder, FairBanks Medical Centre Limited</w:t>
+            </w:r>
+          </w:p>
+          <w:p>
+            <w:pPr>
+              <w:spacing w:after="0"/>
+            </w:pPr>
+            <w:r>
+              <w:rPr>
+                <w:sz w:val="18"/>
+              </w:rPr>
+              <w:t>+256 748 319 052  |  +256 777 462 398  |  info@fairbanksmedicalcentre.org  |  www.fairbanksmedicalcentre.org</w:t>
             </w:r>
           </w:p>
         </w:tc>
@@ -1670,89 +2372,820 @@
           <w:b/>
           <w:sz w:val="26"/>
         </w:rPr>
-        <w:t>8. THE PROPOSAL TO YOU</w:t>
-      </w:r>
-    </w:p>
-    <w:p>
-      <w:r>
-        <w:t>We invite you to consider a strategic investment in FairBanks Medical Centre's Pharmacy, Laboratory and Radiology expansion. The intention is not to request an open-ended capital injection. Instead, FairBanks proposes a clearly defined investment package with a documented use of funds, measurable service-line performance and an agreed mechanism for capital recovery and investor return.</w:t>
-      </w:r>
-    </w:p>
-    <w:p>
-      <w:r>
-        <w:rPr>
-          <w:b/>
-        </w:rPr>
-        <w:t>Our proposed first conversation:</w:t>
+        <w:t>APPENDIX: SUPPLIER QUOTATION AS RECEIVED</w:t>
       </w:r>
     </w:p>
     <w:p>
       <w:pPr>
-        <w:spacing w:after="20"/>
-        <w:ind w:left="288"/>
-      </w:pPr>
-      <w:r>
-        <w:t>• You indicate the level of capital you would be comfortable considering.</w:t>
-      </w:r>
-    </w:p>
-    <w:p>
-      <w:pPr>
-        <w:spacing w:after="20"/>
-        <w:ind w:left="288"/>
-      </w:pPr>
-      <w:r>
-        <w:t>• FairBanks converts the three service lines into a priced procurement and implementation schedule.</w:t>
-      </w:r>
-    </w:p>
-    <w:p>
-      <w:pPr>
-        <w:spacing w:after="20"/>
-        <w:ind w:left="288"/>
-      </w:pPr>
-      <w:r>
-        <w:t>• Both parties agree the funding structure, reporting framework and return mechanism.</w:t>
-      </w:r>
-    </w:p>
-    <w:p>
-      <w:pPr>
-        <w:spacing w:after="20"/>
-        <w:ind w:left="288"/>
-      </w:pPr>
-      <w:r>
-        <w:t>• Funds are released against agreed milestones, followed by monthly performance reporting.</w:t>
-      </w:r>
-    </w:p>
-    <w:p>
-      <w:pPr>
-        <w:spacing w:before="160" w:after="60"/>
+        <w:spacing w:after="80"/>
       </w:pPr>
       <w:r>
         <w:rPr>
-          <w:b/>
-          <w:sz w:val="26"/>
+          <w:i/>
         </w:rPr>
-        <w:t>9. DECISION REQUESTED</w:t>
+        <w:t>Canon Healthcare Systems Ltd, SK House, Kireka-Namugongo Road, Kampala. Proforma invoice 1896, dated 13 April 2026.</w:t>
       </w:r>
     </w:p>
+    <w:tbl>
+      <w:tblPr>
+        <w:tblW w:w="0" w:type="auto"/>
+        <w:jc w:val="center"/>
+        <w:tblLook w:val="04A0" w:firstRow="1" w:lastRow="0" w:firstColumn="1" w:lastColumn="0" w:noHBand="0" w:noVBand="1"/>
+      </w:tblPr>
+      <w:tblGrid>
+        <w:gridCol w:w="600"/>
+        <w:gridCol w:w="4400"/>
+        <w:gridCol w:w="900"/>
+        <w:gridCol w:w="2100"/>
+        <w:gridCol w:w="2282"/>
+      </w:tblGrid>
+      <w:tr>
+        <w:trPr>
+          <w:cantSplit/>
+          <w:tblHeader/>
+          <w:jc w:val="center"/>
+        </w:trPr>
+        <w:tc>
+          <w:tcPr>
+            <w:tcW w:w="600" w:type="dxa"/>
+            <w:shd w:val="clear" w:color="auto" w:fill="165A43"/>
+            <w:vAlign w:val="center"/>
+          </w:tcPr>
+          <w:p>
+            <w:pPr>
+              <w:spacing w:after="0"/>
+              <w:jc w:val="center"/>
+            </w:pPr>
+            <w:r>
+              <w:rPr>
+                <w:b/>
+                <w:color w:val="FFFFFF"/>
+                <w:sz w:val="17"/>
+              </w:rPr>
+              <w:t>#</w:t>
+            </w:r>
+          </w:p>
+        </w:tc>
+        <w:tc>
+          <w:tcPr>
+            <w:tcW w:w="4400" w:type="dxa"/>
+            <w:shd w:val="clear" w:color="auto" w:fill="165A43"/>
+            <w:vAlign w:val="center"/>
+          </w:tcPr>
+          <w:p>
+            <w:pPr>
+              <w:spacing w:after="0"/>
+              <w:jc w:val="center"/>
+            </w:pPr>
+            <w:r>
+              <w:rPr>
+                <w:b/>
+                <w:color w:val="FFFFFF"/>
+                <w:sz w:val="17"/>
+              </w:rPr>
+              <w:t>ITEM</w:t>
+            </w:r>
+          </w:p>
+        </w:tc>
+        <w:tc>
+          <w:tcPr>
+            <w:tcW w:w="900" w:type="dxa"/>
+            <w:shd w:val="clear" w:color="auto" w:fill="165A43"/>
+            <w:vAlign w:val="center"/>
+          </w:tcPr>
+          <w:p>
+            <w:pPr>
+              <w:spacing w:after="0"/>
+              <w:jc w:val="center"/>
+            </w:pPr>
+            <w:r>
+              <w:rPr>
+                <w:b/>
+                <w:color w:val="FFFFFF"/>
+                <w:sz w:val="17"/>
+              </w:rPr>
+              <w:t>QTY</w:t>
+            </w:r>
+          </w:p>
+        </w:tc>
+        <w:tc>
+          <w:tcPr>
+            <w:tcW w:w="2100" w:type="dxa"/>
+            <w:shd w:val="clear" w:color="auto" w:fill="165A43"/>
+            <w:vAlign w:val="center"/>
+          </w:tcPr>
+          <w:p>
+            <w:pPr>
+              <w:spacing w:after="0"/>
+              <w:jc w:val="center"/>
+            </w:pPr>
+            <w:r>
+              <w:rPr>
+                <w:b/>
+                <w:color w:val="FFFFFF"/>
+                <w:sz w:val="17"/>
+              </w:rPr>
+              <w:t>UNIT PRICE (UGX)</w:t>
+            </w:r>
+          </w:p>
+        </w:tc>
+        <w:tc>
+          <w:tcPr>
+            <w:tcW w:w="2282" w:type="dxa"/>
+            <w:shd w:val="clear" w:color="auto" w:fill="165A43"/>
+            <w:vAlign w:val="center"/>
+          </w:tcPr>
+          <w:p>
+            <w:pPr>
+              <w:spacing w:after="0"/>
+              <w:jc w:val="center"/>
+            </w:pPr>
+            <w:r>
+              <w:rPr>
+                <w:b/>
+                <w:color w:val="FFFFFF"/>
+                <w:sz w:val="17"/>
+              </w:rPr>
+              <w:t>TOTAL (UGX)</w:t>
+            </w:r>
+          </w:p>
+        </w:tc>
+      </w:tr>
+      <w:tr>
+        <w:trPr>
+          <w:jc w:val="center"/>
+        </w:trPr>
+        <w:tc>
+          <w:tcPr>
+            <w:tcW w:w="600" w:type="dxa"/>
+            <w:vAlign w:val="center"/>
+          </w:tcPr>
+          <w:p>
+            <w:pPr>
+              <w:spacing w:after="0"/>
+              <w:jc w:val="center"/>
+            </w:pPr>
+            <w:r>
+              <w:rPr>
+                <w:sz w:val="17"/>
+              </w:rPr>
+              <w:t>1</w:t>
+            </w:r>
+          </w:p>
+        </w:tc>
+        <w:tc>
+          <w:tcPr>
+            <w:tcW w:w="4400" w:type="dxa"/>
+            <w:vAlign w:val="center"/>
+          </w:tcPr>
+          <w:p>
+            <w:pPr>
+              <w:spacing w:after="0"/>
+            </w:pPr>
+            <w:r>
+              <w:rPr>
+                <w:sz w:val="17"/>
+              </w:rPr>
+              <w:t>Mindray DP-10 ultrasound machine with printer</w:t>
+            </w:r>
+          </w:p>
+        </w:tc>
+        <w:tc>
+          <w:tcPr>
+            <w:tcW w:w="900" w:type="dxa"/>
+            <w:vAlign w:val="center"/>
+          </w:tcPr>
+          <w:p>
+            <w:pPr>
+              <w:spacing w:after="0"/>
+              <w:jc w:val="center"/>
+            </w:pPr>
+            <w:r>
+              <w:rPr>
+                <w:sz w:val="17"/>
+              </w:rPr>
+              <w:t>1</w:t>
+            </w:r>
+          </w:p>
+        </w:tc>
+        <w:tc>
+          <w:tcPr>
+            <w:tcW w:w="2100" w:type="dxa"/>
+            <w:vAlign w:val="center"/>
+          </w:tcPr>
+          <w:p>
+            <w:pPr>
+              <w:spacing w:after="0"/>
+              <w:jc w:val="right"/>
+            </w:pPr>
+            <w:r>
+              <w:rPr>
+                <w:sz w:val="17"/>
+              </w:rPr>
+              <w:t>10,000,000</w:t>
+            </w:r>
+          </w:p>
+        </w:tc>
+        <w:tc>
+          <w:tcPr>
+            <w:tcW w:w="2282" w:type="dxa"/>
+            <w:vAlign w:val="center"/>
+          </w:tcPr>
+          <w:p>
+            <w:pPr>
+              <w:spacing w:after="0"/>
+              <w:jc w:val="right"/>
+            </w:pPr>
+            <w:r>
+              <w:rPr>
+                <w:sz w:val="17"/>
+              </w:rPr>
+              <w:t>10,000,000</w:t>
+            </w:r>
+          </w:p>
+        </w:tc>
+      </w:tr>
+      <w:tr>
+        <w:trPr>
+          <w:jc w:val="center"/>
+        </w:trPr>
+        <w:tc>
+          <w:tcPr>
+            <w:tcW w:w="600" w:type="dxa"/>
+            <w:vAlign w:val="center"/>
+          </w:tcPr>
+          <w:p>
+            <w:pPr>
+              <w:spacing w:after="0"/>
+              <w:jc w:val="center"/>
+            </w:pPr>
+            <w:r>
+              <w:rPr>
+                <w:sz w:val="17"/>
+              </w:rPr>
+              <w:t>2</w:t>
+            </w:r>
+          </w:p>
+        </w:tc>
+        <w:tc>
+          <w:tcPr>
+            <w:tcW w:w="4400" w:type="dxa"/>
+            <w:vAlign w:val="center"/>
+          </w:tcPr>
+          <w:p>
+            <w:pPr>
+              <w:spacing w:after="0"/>
+            </w:pPr>
+            <w:r>
+              <w:rPr>
+                <w:sz w:val="17"/>
+              </w:rPr>
+              <w:t>Ultrasound trolley</w:t>
+            </w:r>
+          </w:p>
+        </w:tc>
+        <w:tc>
+          <w:tcPr>
+            <w:tcW w:w="900" w:type="dxa"/>
+            <w:vAlign w:val="center"/>
+          </w:tcPr>
+          <w:p>
+            <w:pPr>
+              <w:spacing w:after="0"/>
+              <w:jc w:val="center"/>
+            </w:pPr>
+            <w:r>
+              <w:rPr>
+                <w:sz w:val="17"/>
+              </w:rPr>
+              <w:t>1</w:t>
+            </w:r>
+          </w:p>
+        </w:tc>
+        <w:tc>
+          <w:tcPr>
+            <w:tcW w:w="2100" w:type="dxa"/>
+            <w:vAlign w:val="center"/>
+          </w:tcPr>
+          <w:p>
+            <w:pPr>
+              <w:spacing w:after="0"/>
+              <w:jc w:val="right"/>
+            </w:pPr>
+            <w:r>
+              <w:rPr>
+                <w:sz w:val="17"/>
+              </w:rPr>
+              <w:t>1,000,000</w:t>
+            </w:r>
+          </w:p>
+        </w:tc>
+        <w:tc>
+          <w:tcPr>
+            <w:tcW w:w="2282" w:type="dxa"/>
+            <w:vAlign w:val="center"/>
+          </w:tcPr>
+          <w:p>
+            <w:pPr>
+              <w:spacing w:after="0"/>
+              <w:jc w:val="right"/>
+            </w:pPr>
+            <w:r>
+              <w:rPr>
+                <w:sz w:val="17"/>
+              </w:rPr>
+              <w:t>1,000,000</w:t>
+            </w:r>
+          </w:p>
+        </w:tc>
+      </w:tr>
+      <w:tr>
+        <w:trPr>
+          <w:jc w:val="center"/>
+        </w:trPr>
+        <w:tc>
+          <w:tcPr>
+            <w:tcW w:w="600" w:type="dxa"/>
+            <w:vAlign w:val="center"/>
+          </w:tcPr>
+          <w:p>
+            <w:pPr>
+              <w:spacing w:after="0"/>
+              <w:jc w:val="center"/>
+            </w:pPr>
+            <w:r>
+              <w:rPr>
+                <w:sz w:val="17"/>
+              </w:rPr>
+              <w:t>3</w:t>
+            </w:r>
+          </w:p>
+        </w:tc>
+        <w:tc>
+          <w:tcPr>
+            <w:tcW w:w="4400" w:type="dxa"/>
+            <w:vAlign w:val="center"/>
+          </w:tcPr>
+          <w:p>
+            <w:pPr>
+              <w:spacing w:after="0"/>
+            </w:pPr>
+            <w:r>
+              <w:rPr>
+                <w:sz w:val="17"/>
+              </w:rPr>
+              <w:t>Dry chemistry analyser</w:t>
+            </w:r>
+          </w:p>
+        </w:tc>
+        <w:tc>
+          <w:tcPr>
+            <w:tcW w:w="900" w:type="dxa"/>
+            <w:vAlign w:val="center"/>
+          </w:tcPr>
+          <w:p>
+            <w:pPr>
+              <w:spacing w:after="0"/>
+              <w:jc w:val="center"/>
+            </w:pPr>
+            <w:r>
+              <w:rPr>
+                <w:sz w:val="17"/>
+              </w:rPr>
+              <w:t>1</w:t>
+            </w:r>
+          </w:p>
+        </w:tc>
+        <w:tc>
+          <w:tcPr>
+            <w:tcW w:w="2100" w:type="dxa"/>
+            <w:vAlign w:val="center"/>
+          </w:tcPr>
+          <w:p>
+            <w:pPr>
+              <w:spacing w:after="0"/>
+              <w:jc w:val="right"/>
+            </w:pPr>
+            <w:r>
+              <w:rPr>
+                <w:sz w:val="17"/>
+              </w:rPr>
+              <w:t>14,000,000</w:t>
+            </w:r>
+          </w:p>
+        </w:tc>
+        <w:tc>
+          <w:tcPr>
+            <w:tcW w:w="2282" w:type="dxa"/>
+            <w:vAlign w:val="center"/>
+          </w:tcPr>
+          <w:p>
+            <w:pPr>
+              <w:spacing w:after="0"/>
+              <w:jc w:val="right"/>
+            </w:pPr>
+            <w:r>
+              <w:rPr>
+                <w:sz w:val="17"/>
+              </w:rPr>
+              <w:t>14,000,000</w:t>
+            </w:r>
+          </w:p>
+        </w:tc>
+      </w:tr>
+      <w:tr>
+        <w:trPr>
+          <w:jc w:val="center"/>
+        </w:trPr>
+        <w:tc>
+          <w:tcPr>
+            <w:tcW w:w="600" w:type="dxa"/>
+            <w:vAlign w:val="center"/>
+          </w:tcPr>
+          <w:p>
+            <w:pPr>
+              <w:spacing w:after="0"/>
+              <w:jc w:val="center"/>
+            </w:pPr>
+            <w:r>
+              <w:rPr>
+                <w:sz w:val="17"/>
+              </w:rPr>
+              <w:t>4</w:t>
+            </w:r>
+          </w:p>
+        </w:tc>
+        <w:tc>
+          <w:tcPr>
+            <w:tcW w:w="4400" w:type="dxa"/>
+            <w:vAlign w:val="center"/>
+          </w:tcPr>
+          <w:p>
+            <w:pPr>
+              <w:spacing w:after="0"/>
+            </w:pPr>
+            <w:r>
+              <w:rPr>
+                <w:sz w:val="17"/>
+              </w:rPr>
+              <w:t>Fincare immunoassay analyser</w:t>
+            </w:r>
+          </w:p>
+        </w:tc>
+        <w:tc>
+          <w:tcPr>
+            <w:tcW w:w="900" w:type="dxa"/>
+            <w:vAlign w:val="center"/>
+          </w:tcPr>
+          <w:p>
+            <w:pPr>
+              <w:spacing w:after="0"/>
+              <w:jc w:val="center"/>
+            </w:pPr>
+            <w:r>
+              <w:rPr>
+                <w:sz w:val="17"/>
+              </w:rPr>
+              <w:t>1</w:t>
+            </w:r>
+          </w:p>
+        </w:tc>
+        <w:tc>
+          <w:tcPr>
+            <w:tcW w:w="2100" w:type="dxa"/>
+            <w:vAlign w:val="center"/>
+          </w:tcPr>
+          <w:p>
+            <w:pPr>
+              <w:spacing w:after="0"/>
+              <w:jc w:val="right"/>
+            </w:pPr>
+            <w:r>
+              <w:rPr>
+                <w:sz w:val="17"/>
+              </w:rPr>
+              <w:t>4,000,000</w:t>
+            </w:r>
+          </w:p>
+        </w:tc>
+        <w:tc>
+          <w:tcPr>
+            <w:tcW w:w="2282" w:type="dxa"/>
+            <w:vAlign w:val="center"/>
+          </w:tcPr>
+          <w:p>
+            <w:pPr>
+              <w:spacing w:after="0"/>
+              <w:jc w:val="right"/>
+            </w:pPr>
+            <w:r>
+              <w:rPr>
+                <w:sz w:val="17"/>
+              </w:rPr>
+              <w:t>4,000,000</w:t>
+            </w:r>
+          </w:p>
+        </w:tc>
+      </w:tr>
+      <w:tr>
+        <w:trPr>
+          <w:jc w:val="center"/>
+        </w:trPr>
+        <w:tc>
+          <w:tcPr>
+            <w:tcW w:w="600" w:type="dxa"/>
+            <w:vAlign w:val="center"/>
+          </w:tcPr>
+          <w:p>
+            <w:pPr>
+              <w:spacing w:after="0"/>
+              <w:jc w:val="center"/>
+            </w:pPr>
+            <w:r>
+              <w:rPr>
+                <w:sz w:val="17"/>
+              </w:rPr>
+              <w:t>5</w:t>
+            </w:r>
+          </w:p>
+        </w:tc>
+        <w:tc>
+          <w:tcPr>
+            <w:tcW w:w="4400" w:type="dxa"/>
+            <w:vAlign w:val="center"/>
+          </w:tcPr>
+          <w:p>
+            <w:pPr>
+              <w:spacing w:after="0"/>
+            </w:pPr>
+            <w:r>
+              <w:rPr>
+                <w:sz w:val="17"/>
+              </w:rPr>
+              <w:t>Stabiliser, 2000W</w:t>
+            </w:r>
+          </w:p>
+        </w:tc>
+        <w:tc>
+          <w:tcPr>
+            <w:tcW w:w="900" w:type="dxa"/>
+            <w:vAlign w:val="center"/>
+          </w:tcPr>
+          <w:p>
+            <w:pPr>
+              <w:spacing w:after="0"/>
+              <w:jc w:val="center"/>
+            </w:pPr>
+            <w:r>
+              <w:rPr>
+                <w:sz w:val="17"/>
+              </w:rPr>
+              <w:t>1</w:t>
+            </w:r>
+          </w:p>
+        </w:tc>
+        <w:tc>
+          <w:tcPr>
+            <w:tcW w:w="2100" w:type="dxa"/>
+            <w:vAlign w:val="center"/>
+          </w:tcPr>
+          <w:p>
+            <w:pPr>
+              <w:spacing w:after="0"/>
+              <w:jc w:val="right"/>
+            </w:pPr>
+            <w:r>
+              <w:rPr>
+                <w:sz w:val="17"/>
+              </w:rPr>
+              <w:t>600,000</w:t>
+            </w:r>
+          </w:p>
+        </w:tc>
+        <w:tc>
+          <w:tcPr>
+            <w:tcW w:w="2282" w:type="dxa"/>
+            <w:vAlign w:val="center"/>
+          </w:tcPr>
+          <w:p>
+            <w:pPr>
+              <w:spacing w:after="0"/>
+              <w:jc w:val="right"/>
+            </w:pPr>
+            <w:r>
+              <w:rPr>
+                <w:sz w:val="17"/>
+              </w:rPr>
+              <w:t>600,000</w:t>
+            </w:r>
+          </w:p>
+        </w:tc>
+      </w:tr>
+      <w:tr>
+        <w:trPr>
+          <w:jc w:val="center"/>
+        </w:trPr>
+        <w:tc>
+          <w:tcPr>
+            <w:tcW w:w="600" w:type="dxa"/>
+            <w:vAlign w:val="center"/>
+          </w:tcPr>
+          <w:p>
+            <w:pPr>
+              <w:spacing w:after="0"/>
+              <w:jc w:val="center"/>
+            </w:pPr>
+            <w:r>
+              <w:rPr>
+                <w:sz w:val="17"/>
+              </w:rPr>
+              <w:t>6</w:t>
+            </w:r>
+          </w:p>
+        </w:tc>
+        <w:tc>
+          <w:tcPr>
+            <w:tcW w:w="4400" w:type="dxa"/>
+            <w:vAlign w:val="center"/>
+          </w:tcPr>
+          <w:p>
+            <w:pPr>
+              <w:spacing w:after="0"/>
+            </w:pPr>
+            <w:r>
+              <w:rPr>
+                <w:sz w:val="17"/>
+              </w:rPr>
+              <w:t>Stabiliser, 1000W</w:t>
+            </w:r>
+          </w:p>
+        </w:tc>
+        <w:tc>
+          <w:tcPr>
+            <w:tcW w:w="900" w:type="dxa"/>
+            <w:vAlign w:val="center"/>
+          </w:tcPr>
+          <w:p>
+            <w:pPr>
+              <w:spacing w:after="0"/>
+              <w:jc w:val="center"/>
+            </w:pPr>
+            <w:r>
+              <w:rPr>
+                <w:sz w:val="17"/>
+              </w:rPr>
+              <w:t>1</w:t>
+            </w:r>
+          </w:p>
+        </w:tc>
+        <w:tc>
+          <w:tcPr>
+            <w:tcW w:w="2100" w:type="dxa"/>
+            <w:vAlign w:val="center"/>
+          </w:tcPr>
+          <w:p>
+            <w:pPr>
+              <w:spacing w:after="0"/>
+              <w:jc w:val="right"/>
+            </w:pPr>
+            <w:r>
+              <w:rPr>
+                <w:sz w:val="17"/>
+              </w:rPr>
+              <w:t>300,000</w:t>
+            </w:r>
+          </w:p>
+        </w:tc>
+        <w:tc>
+          <w:tcPr>
+            <w:tcW w:w="2282" w:type="dxa"/>
+            <w:vAlign w:val="center"/>
+          </w:tcPr>
+          <w:p>
+            <w:pPr>
+              <w:spacing w:after="0"/>
+              <w:jc w:val="right"/>
+            </w:pPr>
+            <w:r>
+              <w:rPr>
+                <w:sz w:val="17"/>
+              </w:rPr>
+              <w:t>300,000</w:t>
+            </w:r>
+          </w:p>
+        </w:tc>
+      </w:tr>
+      <w:tr>
+        <w:trPr>
+          <w:jc w:val="center"/>
+        </w:trPr>
+        <w:tc>
+          <w:tcPr>
+            <w:tcW w:w="600" w:type="dxa"/>
+            <w:shd w:val="clear" w:color="auto" w:fill="DDEBE4"/>
+            <w:vAlign w:val="center"/>
+          </w:tcPr>
+          <w:p>
+            <w:pPr>
+              <w:spacing w:after="0"/>
+              <w:jc w:val="center"/>
+            </w:pPr>
+            <w:r>
+              <w:rPr>
+                <w:b/>
+                <w:sz w:val="17"/>
+              </w:rPr>
+              <w:t/>
+            </w:r>
+          </w:p>
+        </w:tc>
+        <w:tc>
+          <w:tcPr>
+            <w:tcW w:w="4400" w:type="dxa"/>
+            <w:shd w:val="clear" w:color="auto" w:fill="DDEBE4"/>
+            <w:vAlign w:val="center"/>
+          </w:tcPr>
+          <w:p>
+            <w:pPr>
+              <w:spacing w:after="0"/>
+            </w:pPr>
+            <w:r>
+              <w:rPr>
+                <w:b/>
+                <w:sz w:val="17"/>
+              </w:rPr>
+              <w:t>TOTAL</w:t>
+            </w:r>
+          </w:p>
+        </w:tc>
+        <w:tc>
+          <w:tcPr>
+            <w:tcW w:w="900" w:type="dxa"/>
+            <w:shd w:val="clear" w:color="auto" w:fill="DDEBE4"/>
+            <w:vAlign w:val="center"/>
+          </w:tcPr>
+          <w:p>
+            <w:pPr>
+              <w:spacing w:after="0"/>
+              <w:jc w:val="center"/>
+            </w:pPr>
+            <w:r>
+              <w:rPr>
+                <w:b/>
+                <w:sz w:val="17"/>
+              </w:rPr>
+              <w:t/>
+            </w:r>
+          </w:p>
+        </w:tc>
+        <w:tc>
+          <w:tcPr>
+            <w:tcW w:w="2100" w:type="dxa"/>
+            <w:shd w:val="clear" w:color="auto" w:fill="DDEBE4"/>
+            <w:vAlign w:val="center"/>
+          </w:tcPr>
+          <w:p>
+            <w:pPr>
+              <w:spacing w:after="0"/>
+              <w:jc w:val="right"/>
+            </w:pPr>
+            <w:r>
+              <w:rPr>
+                <w:b/>
+                <w:sz w:val="17"/>
+              </w:rPr>
+              <w:t/>
+            </w:r>
+          </w:p>
+        </w:tc>
+        <w:tc>
+          <w:tcPr>
+            <w:tcW w:w="2282" w:type="dxa"/>
+            <w:shd w:val="clear" w:color="auto" w:fill="DDEBE4"/>
+            <w:vAlign w:val="center"/>
+          </w:tcPr>
+          <w:p>
+            <w:pPr>
+              <w:spacing w:after="0"/>
+              <w:jc w:val="right"/>
+            </w:pPr>
+            <w:r>
+              <w:rPr>
+                <w:b/>
+                <w:sz w:val="17"/>
+              </w:rPr>
+              <w:t>29,900,000</w:t>
+            </w:r>
+          </w:p>
+        </w:tc>
+      </w:tr>
+    </w:tbl>
     <w:p>
       <w:r>
         <w:rPr>
-          <w:b/>
+          <w:sz w:val="17"/>
         </w:rPr>
-        <w:t>Proposed next step: Agree the investment level you are comfortable considering, then prepare a validated one-page budget and cash-flow schedule showing exactly how the funds will be deployed across Pharmacy, Laboratory and Radiology and how the investor return will be calculated.</w:t>
-      </w:r>
-    </w:p>
-    <w:p>
-      <w:pPr>
-        <w:spacing w:before="240"/>
-        <w:jc w:val="center"/>
-      </w:pPr>
-      <w:r>
-        <w:rPr>
-          <w:b/>
-          <w:sz w:val="24"/>
-        </w:rPr>
-        <w:t>STRENGTHEN THE CORE. INTEGRATE THE SERVICES. GROW WITH DISCIPLINE.</w:t>
+        <w:t>Terms as quoted: prices valid for 60 days from the quotation date, now lapsed; local purchase order to confirm the order; 100% cash or current-dated cheque on delivery; items stated as available in stock.</w:t>
       </w:r>
     </w:p>
     <w:p>
@@ -1763,7 +3196,7 @@
         <w:rPr>
           <w:i/>
         </w:rPr>
-        <w:t>FairBanks Medical Centre Limited | Your Health, Our Mission | Kyebando-Kisalosalo, Tirupati Road, Kampala</w:t>
+        <w:t>FairBanks Medical Centre Limited  |  Your Health, Our Mission  |  Kyebando-Kisalosalo, Tirupati Road, Kampala</w:t>
       </w:r>
     </w:p>
     <w:sectPr>

</xml_diff>

<commit_message>
Revise FairBanks investment proposal and cover letter with updated financial figures
This commit updates the investment proposal and cover letter for the FairBanks Maternity & Inpatient Unit, reflecting a revised total investment range of UGX 192 - 265 million. The changes clarify project scope, including the necessity of an obstetric theatre, and enhance the language in the cover letter to better engage Mr. Alex Kivumbi. Additionally, adjustments were made to ensure consistency across all documents regarding financial estimates and project details.
</commit_message>
<xml_diff>
--- a/new-grants/FairBanks_Pharmacy_Lab_Radiology_Investment_Proposal_Dr_Martin_Muyingo.docx
+++ b/new-grants/FairBanks_Pharmacy_Lab_Radiology_Investment_Proposal_Dr_Martin_Muyingo.docx
@@ -171,7 +171,7 @@
     </w:p>
     <w:p>
       <w:r>
-        <w:t>FairBanks is an operating community-based medical centre in Kyebando-Kisalosalo, on the Northern Bypass corridor. We run general outpatient and inpatient care, a 24-hour emergency and trauma service, a laboratory, X-ray, a licensed retail pharmacy, and specialist clinics covering internal medicine, paediatrics, obstetrics and gynaecology, ENT, ophthalmology, urology and physiotherapy. We are on the CIC and AAR insurance panels, with Jubilee and Mutual in progress. Alongside the clinical service we run GeriCare elderly care, community screenings and health awareness work.</w:t>
+        <w:t>FairBanks is an operating community-based medical centre in Kyebando-Kisalosalo, on the Northern Bypass corridor. We run general outpatient and inpatient care, a 24-hour emergency and trauma service, a laboratory, a licensed retail pharmacy, and specialist clinics covering internal medicine, paediatrics, obstetrics and gynaecology, ENT, ophthalmology, urology and physiotherapy. We are on the CIC and AAR insurance panels, with Jubilee and Mutual in progress. Alongside the clinical service we run GeriCare elderly care, community screenings and health awareness work.</w:t>
       </w:r>
     </w:p>
     <w:p>
@@ -255,7 +255,7 @@
               <w:rPr>
                 <w:sz w:val="17"/>
               </w:rPr>
-              <w:t>OPD, inpatient, 24-hour emergency, X-ray, basic laboratory, pharmacy, seven specialist clinics</w:t>
+              <w:t>OPD, inpatient, 24-hour emergency, basic laboratory, pharmacy, seven specialist clinics</w:t>
             </w:r>
           </w:p>
         </w:tc>
@@ -287,7 +287,7 @@
               <w:rPr>
                 <w:sz w:val="17"/>
               </w:rPr>
-              <w:t>Ultrasound, automated chemistry and immunoassay, consistent pharmacy stock</w:t>
+              <w:t>Any imaging on site, automated chemistry and immunoassay, consistent pharmacy stock</w:t>
             </w:r>
           </w:p>
         </w:tc>
@@ -320,7 +320,7 @@
         <w:t xml:space="preserve">Imaging. </w:t>
       </w:r>
       <w:r>
-        <w:t>We have X-ray. We do not have ultrasound, which is the scan our patients need most often: antenatal checks, abdominal pain, pelvic and soft-tissue work. Every one of those leaves the building. A Mindray DP-10 and a trolley closes the gap for UGX 11 million.</w:t>
+        <w:t>We have none. Every patient needing a scan, whether an antenatal check, abdominal pain or pelvic and soft-tissue work, leaves the building for it, and we refer out work our own consultation rooms generate. Ultrasound is the right place to start: it covers the largest share of what our clinicians actually order, and unlike X-ray it needs no radiation licence, no shielded room and no radiographer. A Mindray DP-10 and a trolley close that gap for UGX 11 million.</w:t>
       </w:r>
     </w:p>
     <w:p>

</xml_diff>